<commit_message>
Rerun 320 Rose buyer credit evaluation
</commit_message>
<xml_diff>
--- a/Project Rooms/Credit Worthiness Evaluator/outputs/320 Rose Ever Cardoza - Creditworthiness Evaluation Report.docx
+++ b/Project Rooms/Credit Worthiness Evaluator/outputs/320 Rose Ever Cardoza - Creditworthiness Evaluation Report.docx
@@ -4,7 +4,7 @@
   <w:body>
     <w:p>
       <w:pPr>
-        <w:spacing w:before="200" w:after="60"/>
+        <w:spacing w:before="200" w:after="60" w:line="264" w:lineRule="auto"/>
         <w:pBdr>
           <w:bottom w:val="single" w:sz="8" w:space="6" w:color="2E74B5"/>
         </w:pBdr>
@@ -13,19 +13,22 @@
         <w:rPr>
           <w:rFonts w:ascii="Calibri" w:hAnsi="Calibri"/>
           <w:b/>
+          <w:i w:val="0"/>
           <w:color w:val="000000"/>
-          <w:sz w:val="42"/>
+          <w:sz w:val="40"/>
         </w:rPr>
-        <w:t>CREDITWORTHINESS EVALUATION REPORT</w:t>
+        <w:t>UPDATED CREDITWORTHINESS EVALUATION REPORT</w:t>
       </w:r>
     </w:p>
     <w:p>
       <w:pPr>
-        <w:spacing w:after="240"/>
+        <w:spacing w:before="0" w:after="240" w:line="264" w:lineRule="auto"/>
       </w:pPr>
       <w:r>
         <w:rPr>
           <w:rFonts w:ascii="Calibri" w:hAnsi="Calibri"/>
+          <w:b w:val="0"/>
+          <w:i w:val="0"/>
           <w:color w:val="5A5A5A"/>
           <w:sz w:val="26"/>
         </w:rPr>
@@ -35,34 +38,37 @@
     <w:tbl>
       <w:tblPr>
         <w:tblStyle w:val="TableGrid"/>
-        <w:tblW w:type="dxa" w:w="9360"/>
+        <w:tblW w:type="auto" w:w="0"/>
         <w:jc w:val="left"/>
         <w:tblLayout w:type="fixed"/>
         <w:tblLook w:firstColumn="1" w:firstRow="1" w:lastColumn="0" w:lastRow="0" w:noHBand="0" w:noVBand="1" w:val="04A0"/>
+        <w:tblW w:w="9360" w:type="dxa"/>
         <w:tblInd w:w="120" w:type="dxa"/>
       </w:tblPr>
       <w:tblGrid>
-        <w:gridCol w:w="2100"/>
-        <w:gridCol w:w="7260"/>
+        <w:gridCol w:w="2300"/>
+        <w:gridCol w:w="7060"/>
       </w:tblGrid>
       <w:tr>
         <w:tc>
           <w:tcPr>
-            <w:tcW w:type="dxa" w:w="2100"/>
+            <w:tcW w:type="dxa" w:w="4680"/>
             <w:shd w:fill="F2F4F7"/>
+            <w:tcW w:w="2300" w:type="dxa"/>
+            <w:vAlign w:val="center"/>
             <w:tcMar>
               <w:top w:w="80" w:type="dxa"/>
+              <w:bottom w:w="80" w:type="dxa"/>
               <w:start w:w="120" w:type="dxa"/>
-              <w:bottom w:w="80" w:type="dxa"/>
               <w:end w:w="120" w:type="dxa"/>
             </w:tcMar>
-            <w:vAlign w:val="center"/>
           </w:tcPr>
           <w:p>
             <w:r>
               <w:rPr>
                 <w:rFonts w:ascii="Calibri" w:hAnsi="Calibri"/>
                 <w:b/>
+                <w:i w:val="0"/>
                 <w:color w:val="000000"/>
                 <w:sz w:val="21"/>
               </w:rPr>
@@ -72,19 +78,22 @@
         </w:tc>
         <w:tc>
           <w:tcPr>
-            <w:tcW w:type="dxa" w:w="7260"/>
+            <w:tcW w:type="dxa" w:w="4680"/>
+            <w:tcW w:w="7060" w:type="dxa"/>
+            <w:vAlign w:val="center"/>
             <w:tcMar>
               <w:top w:w="80" w:type="dxa"/>
+              <w:bottom w:w="80" w:type="dxa"/>
               <w:start w:w="120" w:type="dxa"/>
-              <w:bottom w:w="80" w:type="dxa"/>
               <w:end w:w="120" w:type="dxa"/>
             </w:tcMar>
-            <w:vAlign w:val="center"/>
           </w:tcPr>
           <w:p>
             <w:r>
               <w:rPr>
                 <w:rFonts w:ascii="Calibri" w:hAnsi="Calibri"/>
+                <w:b w:val="0"/>
+                <w:i w:val="0"/>
                 <w:color w:val="000000"/>
                 <w:sz w:val="21"/>
               </w:rPr>
@@ -96,21 +105,23 @@
       <w:tr>
         <w:tc>
           <w:tcPr>
-            <w:tcW w:type="dxa" w:w="2100"/>
+            <w:tcW w:type="dxa" w:w="4680"/>
             <w:shd w:fill="F2F4F7"/>
+            <w:tcW w:w="2300" w:type="dxa"/>
+            <w:vAlign w:val="center"/>
             <w:tcMar>
               <w:top w:w="80" w:type="dxa"/>
+              <w:bottom w:w="80" w:type="dxa"/>
               <w:start w:w="120" w:type="dxa"/>
-              <w:bottom w:w="80" w:type="dxa"/>
               <w:end w:w="120" w:type="dxa"/>
             </w:tcMar>
-            <w:vAlign w:val="center"/>
           </w:tcPr>
           <w:p>
             <w:r>
               <w:rPr>
                 <w:rFonts w:ascii="Calibri" w:hAnsi="Calibri"/>
                 <w:b/>
+                <w:i w:val="0"/>
                 <w:color w:val="000000"/>
                 <w:sz w:val="21"/>
               </w:rPr>
@@ -120,19 +131,22 @@
         </w:tc>
         <w:tc>
           <w:tcPr>
-            <w:tcW w:type="dxa" w:w="7260"/>
+            <w:tcW w:type="dxa" w:w="4680"/>
+            <w:tcW w:w="7060" w:type="dxa"/>
+            <w:vAlign w:val="center"/>
             <w:tcMar>
               <w:top w:w="80" w:type="dxa"/>
+              <w:bottom w:w="80" w:type="dxa"/>
               <w:start w:w="120" w:type="dxa"/>
-              <w:bottom w:w="80" w:type="dxa"/>
               <w:end w:w="120" w:type="dxa"/>
             </w:tcMar>
-            <w:vAlign w:val="center"/>
           </w:tcPr>
           <w:p>
             <w:r>
               <w:rPr>
                 <w:rFonts w:ascii="Calibri" w:hAnsi="Calibri"/>
+                <w:b w:val="0"/>
+                <w:i w:val="0"/>
                 <w:color w:val="000000"/>
                 <w:sz w:val="21"/>
               </w:rPr>
@@ -144,21 +158,23 @@
       <w:tr>
         <w:tc>
           <w:tcPr>
-            <w:tcW w:type="dxa" w:w="2100"/>
+            <w:tcW w:type="dxa" w:w="4680"/>
             <w:shd w:fill="F2F4F7"/>
+            <w:tcW w:w="2300" w:type="dxa"/>
+            <w:vAlign w:val="center"/>
             <w:tcMar>
               <w:top w:w="80" w:type="dxa"/>
+              <w:bottom w:w="80" w:type="dxa"/>
               <w:start w:w="120" w:type="dxa"/>
-              <w:bottom w:w="80" w:type="dxa"/>
               <w:end w:w="120" w:type="dxa"/>
             </w:tcMar>
-            <w:vAlign w:val="center"/>
           </w:tcPr>
           <w:p>
             <w:r>
               <w:rPr>
                 <w:rFonts w:ascii="Calibri" w:hAnsi="Calibri"/>
                 <w:b/>
+                <w:i w:val="0"/>
                 <w:color w:val="000000"/>
                 <w:sz w:val="21"/>
               </w:rPr>
@@ -168,19 +184,22 @@
         </w:tc>
         <w:tc>
           <w:tcPr>
-            <w:tcW w:type="dxa" w:w="7260"/>
+            <w:tcW w:type="dxa" w:w="4680"/>
+            <w:tcW w:w="7060" w:type="dxa"/>
+            <w:vAlign w:val="center"/>
             <w:tcMar>
               <w:top w:w="80" w:type="dxa"/>
+              <w:bottom w:w="80" w:type="dxa"/>
               <w:start w:w="120" w:type="dxa"/>
-              <w:bottom w:w="80" w:type="dxa"/>
               <w:end w:w="120" w:type="dxa"/>
             </w:tcMar>
-            <w:vAlign w:val="center"/>
           </w:tcPr>
           <w:p>
             <w:r>
               <w:rPr>
                 <w:rFonts w:ascii="Calibri" w:hAnsi="Calibri"/>
+                <w:b w:val="0"/>
+                <w:i w:val="0"/>
                 <w:color w:val="000000"/>
                 <w:sz w:val="21"/>
               </w:rPr>
@@ -192,21 +211,23 @@
       <w:tr>
         <w:tc>
           <w:tcPr>
-            <w:tcW w:type="dxa" w:w="2100"/>
+            <w:tcW w:type="dxa" w:w="4680"/>
             <w:shd w:fill="F2F4F7"/>
+            <w:tcW w:w="2300" w:type="dxa"/>
+            <w:vAlign w:val="center"/>
             <w:tcMar>
               <w:top w:w="80" w:type="dxa"/>
+              <w:bottom w:w="80" w:type="dxa"/>
               <w:start w:w="120" w:type="dxa"/>
-              <w:bottom w:w="80" w:type="dxa"/>
               <w:end w:w="120" w:type="dxa"/>
             </w:tcMar>
-            <w:vAlign w:val="center"/>
           </w:tcPr>
           <w:p>
             <w:r>
               <w:rPr>
                 <w:rFonts w:ascii="Calibri" w:hAnsi="Calibri"/>
                 <w:b/>
+                <w:i w:val="0"/>
                 <w:color w:val="000000"/>
                 <w:sz w:val="21"/>
               </w:rPr>
@@ -216,19 +237,22 @@
         </w:tc>
         <w:tc>
           <w:tcPr>
-            <w:tcW w:type="dxa" w:w="7260"/>
+            <w:tcW w:type="dxa" w:w="4680"/>
+            <w:tcW w:w="7060" w:type="dxa"/>
+            <w:vAlign w:val="center"/>
             <w:tcMar>
               <w:top w:w="80" w:type="dxa"/>
+              <w:bottom w:w="80" w:type="dxa"/>
               <w:start w:w="120" w:type="dxa"/>
-              <w:bottom w:w="80" w:type="dxa"/>
               <w:end w:w="120" w:type="dxa"/>
             </w:tcMar>
-            <w:vAlign w:val="center"/>
           </w:tcPr>
           <w:p>
             <w:r>
               <w:rPr>
                 <w:rFonts w:ascii="Calibri" w:hAnsi="Calibri"/>
+                <w:b w:val="0"/>
+                <w:i w:val="0"/>
                 <w:color w:val="000000"/>
                 <w:sz w:val="21"/>
               </w:rPr>
@@ -240,21 +264,23 @@
       <w:tr>
         <w:tc>
           <w:tcPr>
-            <w:tcW w:type="dxa" w:w="2100"/>
+            <w:tcW w:type="dxa" w:w="4680"/>
             <w:shd w:fill="F2F4F7"/>
+            <w:tcW w:w="2300" w:type="dxa"/>
+            <w:vAlign w:val="center"/>
             <w:tcMar>
               <w:top w:w="80" w:type="dxa"/>
+              <w:bottom w:w="80" w:type="dxa"/>
               <w:start w:w="120" w:type="dxa"/>
-              <w:bottom w:w="80" w:type="dxa"/>
               <w:end w:w="120" w:type="dxa"/>
             </w:tcMar>
-            <w:vAlign w:val="center"/>
           </w:tcPr>
           <w:p>
             <w:r>
               <w:rPr>
                 <w:rFonts w:ascii="Calibri" w:hAnsi="Calibri"/>
                 <w:b/>
+                <w:i w:val="0"/>
                 <w:color w:val="000000"/>
                 <w:sz w:val="21"/>
               </w:rPr>
@@ -264,23 +290,26 @@
         </w:tc>
         <w:tc>
           <w:tcPr>
-            <w:tcW w:type="dxa" w:w="7260"/>
+            <w:tcW w:type="dxa" w:w="4680"/>
+            <w:tcW w:w="7060" w:type="dxa"/>
+            <w:vAlign w:val="center"/>
             <w:tcMar>
               <w:top w:w="80" w:type="dxa"/>
+              <w:bottom w:w="80" w:type="dxa"/>
               <w:start w:w="120" w:type="dxa"/>
-              <w:bottom w:w="80" w:type="dxa"/>
               <w:end w:w="120" w:type="dxa"/>
             </w:tcMar>
-            <w:vAlign w:val="center"/>
           </w:tcPr>
           <w:p>
             <w:r>
               <w:rPr>
                 <w:rFonts w:ascii="Calibri" w:hAnsi="Calibri"/>
+                <w:b w:val="0"/>
+                <w:i w:val="0"/>
                 <w:color w:val="000000"/>
                 <w:sz w:val="21"/>
               </w:rPr>
-              <w:t>Preliminary ability-to-repay and file-completeness review for proposed seller financing</w:t>
+              <w:t>Rerun preliminary ability-to-repay and file-completeness review after new Ever documents</w:t>
             </w:r>
           </w:p>
         </w:tc>
@@ -288,21 +317,23 @@
       <w:tr>
         <w:tc>
           <w:tcPr>
-            <w:tcW w:type="dxa" w:w="2100"/>
+            <w:tcW w:type="dxa" w:w="4680"/>
             <w:shd w:fill="F2F4F7"/>
+            <w:tcW w:w="2300" w:type="dxa"/>
+            <w:vAlign w:val="center"/>
             <w:tcMar>
               <w:top w:w="80" w:type="dxa"/>
+              <w:bottom w:w="80" w:type="dxa"/>
               <w:start w:w="120" w:type="dxa"/>
-              <w:bottom w:w="80" w:type="dxa"/>
               <w:end w:w="120" w:type="dxa"/>
             </w:tcMar>
-            <w:vAlign w:val="center"/>
           </w:tcPr>
           <w:p>
             <w:r>
               <w:rPr>
                 <w:rFonts w:ascii="Calibri" w:hAnsi="Calibri"/>
                 <w:b/>
+                <w:i w:val="0"/>
                 <w:color w:val="000000"/>
                 <w:sz w:val="21"/>
               </w:rPr>
@@ -312,23 +343,26 @@
         </w:tc>
         <w:tc>
           <w:tcPr>
-            <w:tcW w:type="dxa" w:w="7260"/>
+            <w:tcW w:type="dxa" w:w="4680"/>
+            <w:tcW w:w="7060" w:type="dxa"/>
+            <w:vAlign w:val="center"/>
             <w:tcMar>
               <w:top w:w="80" w:type="dxa"/>
+              <w:bottom w:w="80" w:type="dxa"/>
               <w:start w:w="120" w:type="dxa"/>
-              <w:bottom w:w="80" w:type="dxa"/>
               <w:end w:w="120" w:type="dxa"/>
             </w:tcMar>
-            <w:vAlign w:val="center"/>
           </w:tcPr>
           <w:p>
             <w:r>
               <w:rPr>
                 <w:rFonts w:ascii="Calibri" w:hAnsi="Calibri"/>
+                <w:b w:val="0"/>
+                <w:i w:val="0"/>
                 <w:color w:val="000000"/>
                 <w:sz w:val="21"/>
               </w:rPr>
-              <w:t>Do not approve from the current file</w:t>
+              <w:t>Do not approve from the current file; conditionally reconsider with verified net income and reserve proof</w:t>
             </w:r>
           </w:p>
         </w:tc>
@@ -336,16 +370,17 @@
     </w:tbl>
     <w:p>
       <w:pPr>
-        <w:spacing w:after="40"/>
+        <w:spacing w:before="0" w:after="40" w:line="264" w:lineRule="auto"/>
       </w:pPr>
     </w:p>
     <w:tbl>
       <w:tblPr>
         <w:tblStyle w:val="TableGrid"/>
-        <w:tblW w:type="dxa" w:w="9360"/>
+        <w:tblW w:type="auto" w:w="0"/>
         <w:jc w:val="left"/>
         <w:tblLayout w:type="fixed"/>
         <w:tblLook w:firstColumn="1" w:firstRow="1" w:lastColumn="0" w:lastRow="0" w:noHBand="0" w:noVBand="1" w:val="04A0"/>
+        <w:tblW w:w="9360" w:type="dxa"/>
         <w:tblInd w:w="120" w:type="dxa"/>
       </w:tblPr>
       <w:tblGrid>
@@ -356,22 +391,21 @@
           <w:tcPr>
             <w:tcW w:type="dxa" w:w="9360"/>
             <w:shd w:fill="F8EAEA"/>
+            <w:tcW w:w="9360" w:type="dxa"/>
+            <w:vAlign w:val="center"/>
             <w:tcMar>
               <w:top w:w="80" w:type="dxa"/>
+              <w:bottom w:w="80" w:type="dxa"/>
               <w:start w:w="120" w:type="dxa"/>
-              <w:bottom w:w="80" w:type="dxa"/>
               <w:end w:w="120" w:type="dxa"/>
             </w:tcMar>
-            <w:vAlign w:val="center"/>
           </w:tcPr>
           <w:p>
-            <w:pPr>
-              <w:spacing w:after="80"/>
-            </w:pPr>
             <w:r>
               <w:rPr>
                 <w:rFonts w:ascii="Calibri" w:hAnsi="Calibri"/>
                 <w:b/>
+                <w:i w:val="0"/>
                 <w:color w:val="9B1C1C"/>
                 <w:sz w:val="22"/>
               </w:rPr>
@@ -380,15 +414,17 @@
           </w:p>
           <w:p>
             <w:pPr>
-              <w:spacing w:after="40" w:line="264" w:lineRule="auto"/>
+              <w:spacing w:line="264" w:lineRule="auto"/>
             </w:pPr>
             <w:r>
               <w:rPr>
                 <w:rFonts w:ascii="Calibri" w:hAnsi="Calibri"/>
+                <w:b w:val="0"/>
+                <w:i w:val="0"/>
                 <w:color w:val="000000"/>
                 <w:sz w:val="21"/>
               </w:rPr>
-              <w:t>Investment Services, LLC recommends that the buyer not be approved from the current file. The file contains favorable screening items, but it does not provide verified self-employment income, proof of down payment or reserves, or a current bank-statement package sufficient to support the proposed seller-financed payment.</w:t>
+              <w:t>The new documents materially improve the file because they show active Matthew Flooring LLC business cash flow and timely rent history. Investment Services, LLC still recommends no approval from the current package because the file does not verify borrower-level net self-employment income, cash to close, or reserves.</w:t>
             </w:r>
           </w:p>
         </w:tc>
@@ -396,7 +432,7 @@
     </w:tbl>
     <w:p>
       <w:pPr>
-        <w:spacing w:after="40"/>
+        <w:spacing w:before="0" w:after="40" w:line="264" w:lineRule="auto"/>
       </w:pPr>
     </w:p>
     <w:p>
@@ -409,24 +445,62 @@
         <w:rPr>
           <w:rFonts w:ascii="Calibri" w:hAnsi="Calibri"/>
           <w:b/>
+          <w:i w:val="0"/>
           <w:color w:val="2E74B5"/>
           <w:sz w:val="32"/>
         </w:rPr>
-        <w:t>Basis Of Review</w:t>
+        <w:t>What Changed In This Rerun</w:t>
       </w:r>
     </w:p>
     <w:p>
       <w:pPr>
-        <w:spacing w:before="0" w:after="120" w:line="264" w:lineRule="auto"/>
+        <w:pStyle w:val="ListBullet"/>
+        <w:spacing w:after="140" w:line="280" w:lineRule="auto"/>
+        <w:ind w:left="720" w:hanging="360"/>
       </w:pPr>
       <w:r>
         <w:rPr>
           <w:rFonts w:ascii="Calibri" w:hAnsi="Calibri"/>
           <w:b w:val="0"/>
+          <w:i w:val="0"/>
           <w:color w:val="000000"/>
           <w:sz w:val="22"/>
         </w:rPr>
-        <w:t>This report is based on the refreshed Credit Worthiness Evaluator project room source set copied from the Teams-synced Rose Pl / Ever Cordoza folder on June 5, 2026. It distinguishes supported source facts from underwriting assumptions and does not provide legal advice or a final compliance determination.</w:t>
+        <w:t>New Matthew Flooring LLC business bank statements were reviewed from January 2025 through May 2026.</w:t>
+      </w:r>
+    </w:p>
+    <w:p>
+      <w:pPr>
+        <w:pStyle w:val="ListBullet"/>
+        <w:spacing w:after="140" w:line="280" w:lineRule="auto"/>
+        <w:ind w:left="720" w:hanging="360"/>
+      </w:pPr>
+      <w:r>
+        <w:rPr>
+          <w:rFonts w:ascii="Calibri" w:hAnsi="Calibri"/>
+          <w:b w:val="0"/>
+          <w:i w:val="0"/>
+          <w:color w:val="000000"/>
+          <w:sz w:val="22"/>
+        </w:rPr>
+        <w:t>A Buy Your Home rent payment verification letter states Ever Cardoza rented 4121 Tensity Dr from July 2025 through June 2026 at $1,850/month and paid timely.</w:t>
+      </w:r>
+    </w:p>
+    <w:p>
+      <w:pPr>
+        <w:pStyle w:val="ListBullet"/>
+        <w:spacing w:after="140" w:line="280" w:lineRule="auto"/>
+        <w:ind w:left="720" w:hanging="360"/>
+      </w:pPr>
+      <w:r>
+        <w:rPr>
+          <w:rFonts w:ascii="Calibri" w:hAnsi="Calibri"/>
+          <w:b w:val="0"/>
+          <w:i w:val="0"/>
+          <w:color w:val="000000"/>
+          <w:sz w:val="22"/>
+        </w:rPr>
+        <w:t>The new business statements support real business activity and gross revenue, but not net borrower income by themselves.</w:t>
       </w:r>
     </w:p>
     <w:p>
@@ -434,42 +508,63 @@
         <w:br w:type="page"/>
       </w:r>
     </w:p>
+    <w:p>
+      <w:pPr>
+        <w:pStyle w:val="Heading1"/>
+        <w:keepNext/>
+        <w:spacing w:before="320" w:after="160"/>
+      </w:pPr>
+      <w:r>
+        <w:rPr>
+          <w:rFonts w:ascii="Calibri" w:hAnsi="Calibri"/>
+          <w:b/>
+          <w:i w:val="0"/>
+          <w:color w:val="2E74B5"/>
+          <w:sz w:val="32"/>
+        </w:rPr>
+        <w:t>Transaction Snapshot</w:t>
+      </w:r>
+    </w:p>
     <w:tbl>
       <w:tblPr>
         <w:tblStyle w:val="TableGrid"/>
-        <w:tblW w:type="dxa" w:w="9360"/>
+        <w:tblW w:type="auto" w:w="0"/>
         <w:jc w:val="left"/>
         <w:tblLayout w:type="fixed"/>
         <w:tblLook w:firstColumn="1" w:firstRow="1" w:lastColumn="0" w:lastRow="0" w:noHBand="0" w:noVBand="1" w:val="04A0"/>
+        <w:tblW w:w="9360" w:type="dxa"/>
         <w:tblInd w:w="120" w:type="dxa"/>
       </w:tblPr>
       <w:tblGrid>
-        <w:gridCol w:w="2100"/>
-        <w:gridCol w:w="7260"/>
+        <w:gridCol w:w="2300"/>
+        <w:gridCol w:w="7060"/>
       </w:tblGrid>
       <w:tr>
         <w:tc>
           <w:tcPr>
-            <w:tcW w:type="dxa" w:w="7260"/>
+            <w:tcW w:type="dxa" w:w="9360"/>
             <w:gridSpan w:val="2"/>
             <w:shd w:fill="F2F4F7"/>
+            <w:tcW w:w="2300" w:type="dxa"/>
+            <w:vAlign w:val="center"/>
             <w:tcMar>
               <w:top w:w="80" w:type="dxa"/>
+              <w:bottom w:w="80" w:type="dxa"/>
               <w:start w:w="120" w:type="dxa"/>
-              <w:bottom w:w="80" w:type="dxa"/>
               <w:end w:w="120" w:type="dxa"/>
             </w:tcMar>
-            <w:vAlign w:val="center"/>
+            <w:tcW w:w="7060" w:type="dxa"/>
           </w:tcPr>
           <w:p>
             <w:r>
               <w:rPr>
                 <w:rFonts w:ascii="Calibri" w:hAnsi="Calibri"/>
                 <w:b/>
+                <w:i w:val="0"/>
                 <w:color w:val="000000"/>
                 <w:sz w:val="21"/>
               </w:rPr>
-              <w:t>Source Categories</w:t>
+              <w:t>Supported Transaction Facts</w:t>
             </w:r>
           </w:p>
         </w:tc>
@@ -477,47 +572,52 @@
       <w:tr>
         <w:tc>
           <w:tcPr>
-            <w:tcW w:type="dxa" w:w="2100"/>
+            <w:tcW w:type="dxa" w:w="4680"/>
             <w:shd w:fill="F2F4F7"/>
+            <w:tcW w:w="2300" w:type="dxa"/>
+            <w:vAlign w:val="center"/>
             <w:tcMar>
               <w:top w:w="80" w:type="dxa"/>
+              <w:bottom w:w="80" w:type="dxa"/>
               <w:start w:w="120" w:type="dxa"/>
-              <w:bottom w:w="80" w:type="dxa"/>
               <w:end w:w="120" w:type="dxa"/>
             </w:tcMar>
-            <w:vAlign w:val="center"/>
           </w:tcPr>
           <w:p>
             <w:r>
               <w:rPr>
                 <w:rFonts w:ascii="Calibri" w:hAnsi="Calibri"/>
                 <w:b/>
+                <w:i w:val="0"/>
                 <w:color w:val="000000"/>
                 <w:sz w:val="21"/>
               </w:rPr>
-              <w:t>Meeting materials</w:t>
+              <w:t>Purchase price</w:t>
             </w:r>
           </w:p>
         </w:tc>
         <w:tc>
           <w:tcPr>
-            <w:tcW w:type="dxa" w:w="7260"/>
+            <w:tcW w:type="dxa" w:w="4680"/>
+            <w:tcW w:w="7060" w:type="dxa"/>
+            <w:vAlign w:val="center"/>
             <w:tcMar>
               <w:top w:w="80" w:type="dxa"/>
+              <w:bottom w:w="80" w:type="dxa"/>
               <w:start w:w="120" w:type="dxa"/>
-              <w:bottom w:w="80" w:type="dxa"/>
               <w:end w:w="120" w:type="dxa"/>
             </w:tcMar>
-            <w:vAlign w:val="center"/>
           </w:tcPr>
           <w:p>
             <w:r>
               <w:rPr>
                 <w:rFonts w:ascii="Calibri" w:hAnsi="Calibri"/>
+                <w:b w:val="0"/>
+                <w:i w:val="0"/>
                 <w:color w:val="000000"/>
                 <w:sz w:val="21"/>
               </w:rPr>
-              <w:t>Purchase summary and transcript for the June 4, 2026 buyer meeting.</w:t>
+              <w:t>$346,500 implied from a stated 6% down payment of $20,790.</w:t>
             </w:r>
           </w:p>
         </w:tc>
@@ -525,47 +625,52 @@
       <w:tr>
         <w:tc>
           <w:tcPr>
-            <w:tcW w:type="dxa" w:w="2100"/>
+            <w:tcW w:type="dxa" w:w="4680"/>
             <w:shd w:fill="F2F4F7"/>
+            <w:tcW w:w="2300" w:type="dxa"/>
+            <w:vAlign w:val="center"/>
             <w:tcMar>
               <w:top w:w="80" w:type="dxa"/>
+              <w:bottom w:w="80" w:type="dxa"/>
               <w:start w:w="120" w:type="dxa"/>
-              <w:bottom w:w="80" w:type="dxa"/>
               <w:end w:w="120" w:type="dxa"/>
             </w:tcMar>
-            <w:vAlign w:val="center"/>
           </w:tcPr>
           <w:p>
             <w:r>
               <w:rPr>
                 <w:rFonts w:ascii="Calibri" w:hAnsi="Calibri"/>
                 <w:b/>
+                <w:i w:val="0"/>
                 <w:color w:val="000000"/>
                 <w:sz w:val="21"/>
               </w:rPr>
-              <w:t>Application materials</w:t>
+              <w:t>Proposed monthly payment</w:t>
             </w:r>
           </w:p>
         </w:tc>
         <w:tc>
           <w:tcPr>
-            <w:tcW w:type="dxa" w:w="7260"/>
+            <w:tcW w:type="dxa" w:w="4680"/>
+            <w:tcW w:w="7060" w:type="dxa"/>
+            <w:vAlign w:val="center"/>
             <w:tcMar>
               <w:top w:w="80" w:type="dxa"/>
+              <w:bottom w:w="80" w:type="dxa"/>
               <w:start w:w="120" w:type="dxa"/>
-              <w:bottom w:w="80" w:type="dxa"/>
               <w:end w:w="120" w:type="dxa"/>
             </w:tcMar>
-            <w:vAlign w:val="center"/>
           </w:tcPr>
           <w:p>
             <w:r>
               <w:rPr>
                 <w:rFonts w:ascii="Calibri" w:hAnsi="Calibri"/>
+                <w:b w:val="0"/>
+                <w:i w:val="0"/>
                 <w:color w:val="000000"/>
                 <w:sz w:val="21"/>
               </w:rPr>
-              <w:t>Applicant details, credit report, and background check generated through the Zillow screening package.</w:t>
+              <w:t>$2,701, described as including principal, interest, property taxes, and insurance escrow.</w:t>
             </w:r>
           </w:p>
         </w:tc>
@@ -573,47 +678,52 @@
       <w:tr>
         <w:tc>
           <w:tcPr>
-            <w:tcW w:type="dxa" w:w="2100"/>
+            <w:tcW w:type="dxa" w:w="4680"/>
             <w:shd w:fill="F2F4F7"/>
+            <w:tcW w:w="2300" w:type="dxa"/>
+            <w:vAlign w:val="center"/>
             <w:tcMar>
               <w:top w:w="80" w:type="dxa"/>
+              <w:bottom w:w="80" w:type="dxa"/>
               <w:start w:w="120" w:type="dxa"/>
-              <w:bottom w:w="80" w:type="dxa"/>
               <w:end w:w="120" w:type="dxa"/>
             </w:tcMar>
-            <w:vAlign w:val="center"/>
           </w:tcPr>
           <w:p>
             <w:r>
               <w:rPr>
                 <w:rFonts w:ascii="Calibri" w:hAnsi="Calibri"/>
                 <w:b/>
+                <w:i w:val="0"/>
                 <w:color w:val="000000"/>
                 <w:sz w:val="21"/>
               </w:rPr>
-              <w:t>Bank materials</w:t>
+              <w:t>Earnest money</w:t>
             </w:r>
           </w:p>
         </w:tc>
         <w:tc>
           <w:tcPr>
-            <w:tcW w:type="dxa" w:w="7260"/>
+            <w:tcW w:type="dxa" w:w="4680"/>
+            <w:tcW w:w="7060" w:type="dxa"/>
+            <w:vAlign w:val="center"/>
             <w:tcMar>
               <w:top w:w="80" w:type="dxa"/>
+              <w:bottom w:w="80" w:type="dxa"/>
               <w:start w:w="120" w:type="dxa"/>
-              <w:bottom w:w="80" w:type="dxa"/>
               <w:end w:w="120" w:type="dxa"/>
             </w:tcMar>
-            <w:vAlign w:val="center"/>
           </w:tcPr>
           <w:p>
             <w:r>
               <w:rPr>
                 <w:rFonts w:ascii="Calibri" w:hAnsi="Calibri"/>
+                <w:b w:val="0"/>
+                <w:i w:val="0"/>
                 <w:color w:val="000000"/>
                 <w:sz w:val="21"/>
               </w:rPr>
-              <w:t>Wells Fargo statement PDFs labeled January through December 2025, plus an April 2025 email attachment that duplicates the April statement.</w:t>
+              <w:t>$6,000 due at contract signing, with remaining down payment due at attorney closing.</w:t>
             </w:r>
           </w:p>
         </w:tc>
@@ -621,47 +731,158 @@
       <w:tr>
         <w:tc>
           <w:tcPr>
-            <w:tcW w:type="dxa" w:w="2100"/>
+            <w:tcW w:type="dxa" w:w="4680"/>
             <w:shd w:fill="F2F4F7"/>
+            <w:tcW w:w="2300" w:type="dxa"/>
+            <w:vAlign w:val="center"/>
             <w:tcMar>
               <w:top w:w="80" w:type="dxa"/>
+              <w:bottom w:w="80" w:type="dxa"/>
               <w:start w:w="120" w:type="dxa"/>
-              <w:bottom w:w="80" w:type="dxa"/>
               <w:end w:w="120" w:type="dxa"/>
             </w:tcMar>
-            <w:vAlign w:val="center"/>
           </w:tcPr>
           <w:p>
             <w:r>
               <w:rPr>
                 <w:rFonts w:ascii="Calibri" w:hAnsi="Calibri"/>
                 <w:b/>
+                <w:i w:val="0"/>
                 <w:color w:val="000000"/>
                 <w:sz w:val="21"/>
               </w:rPr>
-              <w:t>Working extracts</w:t>
+              <w:t>Rent history</w:t>
             </w:r>
           </w:p>
         </w:tc>
         <w:tc>
           <w:tcPr>
-            <w:tcW w:type="dxa" w:w="7260"/>
+            <w:tcW w:type="dxa" w:w="4680"/>
+            <w:tcW w:w="7060" w:type="dxa"/>
+            <w:vAlign w:val="center"/>
             <w:tcMar>
               <w:top w:w="80" w:type="dxa"/>
+              <w:bottom w:w="80" w:type="dxa"/>
               <w:start w:w="120" w:type="dxa"/>
-              <w:bottom w:w="80" w:type="dxa"/>
               <w:end w:w="120" w:type="dxa"/>
             </w:tcMar>
-            <w:vAlign w:val="center"/>
           </w:tcPr>
           <w:p>
             <w:r>
               <w:rPr>
                 <w:rFonts w:ascii="Calibri" w:hAnsi="Calibri"/>
+                <w:b w:val="0"/>
+                <w:i w:val="0"/>
                 <w:color w:val="000000"/>
                 <w:sz w:val="21"/>
               </w:rPr>
-              <w:t>Machine text extraction used for review; source PDFs remain controlling if any extraction issue is found.</w:t>
+              <w:t>Buy Your Home letter states $1,850/month rent from July 2025 through June 2026 and timely payments.</w:t>
+            </w:r>
+          </w:p>
+        </w:tc>
+      </w:tr>
+      <w:tr>
+        <w:tc>
+          <w:tcPr>
+            <w:tcW w:type="dxa" w:w="4680"/>
+            <w:shd w:fill="F2F4F7"/>
+            <w:tcW w:w="2300" w:type="dxa"/>
+            <w:vAlign w:val="center"/>
+            <w:tcMar>
+              <w:top w:w="80" w:type="dxa"/>
+              <w:bottom w:w="80" w:type="dxa"/>
+              <w:start w:w="120" w:type="dxa"/>
+              <w:end w:w="120" w:type="dxa"/>
+            </w:tcMar>
+          </w:tcPr>
+          <w:p>
+            <w:r>
+              <w:rPr>
+                <w:rFonts w:ascii="Calibri" w:hAnsi="Calibri"/>
+                <w:b/>
+                <w:i w:val="0"/>
+                <w:color w:val="000000"/>
+                <w:sz w:val="21"/>
+              </w:rPr>
+              <w:t>Current rent in Zillow application</w:t>
+            </w:r>
+          </w:p>
+        </w:tc>
+        <w:tc>
+          <w:tcPr>
+            <w:tcW w:type="dxa" w:w="4680"/>
+            <w:tcW w:w="7060" w:type="dxa"/>
+            <w:vAlign w:val="center"/>
+            <w:tcMar>
+              <w:top w:w="80" w:type="dxa"/>
+              <w:bottom w:w="80" w:type="dxa"/>
+              <w:start w:w="120" w:type="dxa"/>
+              <w:end w:w="120" w:type="dxa"/>
+            </w:tcMar>
+          </w:tcPr>
+          <w:p>
+            <w:r>
+              <w:rPr>
+                <w:rFonts w:ascii="Calibri" w:hAnsi="Calibri"/>
+                <w:b w:val="0"/>
+                <w:i w:val="0"/>
+                <w:color w:val="000000"/>
+                <w:sz w:val="21"/>
+              </w:rPr>
+              <w:t>$1,885/month shown in applicant details.</w:t>
+            </w:r>
+          </w:p>
+        </w:tc>
+      </w:tr>
+      <w:tr>
+        <w:tc>
+          <w:tcPr>
+            <w:tcW w:type="dxa" w:w="4680"/>
+            <w:shd w:fill="F2F4F7"/>
+            <w:tcW w:w="2300" w:type="dxa"/>
+            <w:vAlign w:val="center"/>
+            <w:tcMar>
+              <w:top w:w="80" w:type="dxa"/>
+              <w:bottom w:w="80" w:type="dxa"/>
+              <w:start w:w="120" w:type="dxa"/>
+              <w:end w:w="120" w:type="dxa"/>
+            </w:tcMar>
+          </w:tcPr>
+          <w:p>
+            <w:r>
+              <w:rPr>
+                <w:rFonts w:ascii="Calibri" w:hAnsi="Calibri"/>
+                <w:b/>
+                <w:i w:val="0"/>
+                <w:color w:val="000000"/>
+                <w:sz w:val="21"/>
+              </w:rPr>
+              <w:t>Structure still unresolved</w:t>
+            </w:r>
+          </w:p>
+        </w:tc>
+        <w:tc>
+          <w:tcPr>
+            <w:tcW w:type="dxa" w:w="4680"/>
+            <w:tcW w:w="7060" w:type="dxa"/>
+            <w:vAlign w:val="center"/>
+            <w:tcMar>
+              <w:top w:w="80" w:type="dxa"/>
+              <w:bottom w:w="80" w:type="dxa"/>
+              <w:start w:w="120" w:type="dxa"/>
+              <w:end w:w="120" w:type="dxa"/>
+            </w:tcMar>
+          </w:tcPr>
+          <w:p>
+            <w:r>
+              <w:rPr>
+                <w:rFonts w:ascii="Calibri" w:hAnsi="Calibri"/>
+                <w:b w:val="0"/>
+                <w:i w:val="0"/>
+                <w:color w:val="000000"/>
+                <w:sz w:val="21"/>
+              </w:rPr>
+              <w:t>Meeting materials use mixed language about note/mortgage-style financing and deed-transfer-after-payoff structure.</w:t>
             </w:r>
           </w:p>
         </w:tc>
@@ -669,7 +890,7 @@
     </w:tbl>
     <w:p>
       <w:pPr>
-        <w:spacing w:after="40"/>
+        <w:spacing w:before="0" w:after="40" w:line="264" w:lineRule="auto"/>
       </w:pPr>
     </w:p>
     <w:p>
@@ -682,356 +903,7 @@
         <w:rPr>
           <w:rFonts w:ascii="Calibri" w:hAnsi="Calibri"/>
           <w:b/>
-          <w:color w:val="2E74B5"/>
-          <w:sz w:val="32"/>
-        </w:rPr>
-        <w:t>Transaction Snapshot</w:t>
-      </w:r>
-    </w:p>
-    <w:tbl>
-      <w:tblPr>
-        <w:tblStyle w:val="TableGrid"/>
-        <w:tblW w:type="dxa" w:w="9360"/>
-        <w:jc w:val="left"/>
-        <w:tblLayout w:type="fixed"/>
-        <w:tblLook w:firstColumn="1" w:firstRow="1" w:lastColumn="0" w:lastRow="0" w:noHBand="0" w:noVBand="1" w:val="04A0"/>
-        <w:tblInd w:w="120" w:type="dxa"/>
-      </w:tblPr>
-      <w:tblGrid>
-        <w:gridCol w:w="2100"/>
-        <w:gridCol w:w="7260"/>
-      </w:tblGrid>
-      <w:tr>
-        <w:tc>
-          <w:tcPr>
-            <w:tcW w:type="dxa" w:w="7260"/>
-            <w:gridSpan w:val="2"/>
-            <w:shd w:fill="F2F4F7"/>
-            <w:tcMar>
-              <w:top w:w="80" w:type="dxa"/>
-              <w:start w:w="120" w:type="dxa"/>
-              <w:bottom w:w="80" w:type="dxa"/>
-              <w:end w:w="120" w:type="dxa"/>
-            </w:tcMar>
-            <w:vAlign w:val="center"/>
-          </w:tcPr>
-          <w:p>
-            <w:r>
-              <w:rPr>
-                <w:rFonts w:ascii="Calibri" w:hAnsi="Calibri"/>
-                <w:b/>
-                <w:color w:val="000000"/>
-                <w:sz w:val="21"/>
-              </w:rPr>
-              <w:t>Supported Transaction Facts</w:t>
-            </w:r>
-          </w:p>
-        </w:tc>
-      </w:tr>
-      <w:tr>
-        <w:tc>
-          <w:tcPr>
-            <w:tcW w:type="dxa" w:w="2100"/>
-            <w:shd w:fill="F2F4F7"/>
-            <w:tcMar>
-              <w:top w:w="80" w:type="dxa"/>
-              <w:start w:w="120" w:type="dxa"/>
-              <w:bottom w:w="80" w:type="dxa"/>
-              <w:end w:w="120" w:type="dxa"/>
-            </w:tcMar>
-            <w:vAlign w:val="center"/>
-          </w:tcPr>
-          <w:p>
-            <w:r>
-              <w:rPr>
-                <w:rFonts w:ascii="Calibri" w:hAnsi="Calibri"/>
-                <w:b/>
-                <w:color w:val="000000"/>
-                <w:sz w:val="21"/>
-              </w:rPr>
-              <w:t>Purchase price</w:t>
-            </w:r>
-          </w:p>
-        </w:tc>
-        <w:tc>
-          <w:tcPr>
-            <w:tcW w:type="dxa" w:w="7260"/>
-            <w:tcMar>
-              <w:top w:w="80" w:type="dxa"/>
-              <w:start w:w="120" w:type="dxa"/>
-              <w:bottom w:w="80" w:type="dxa"/>
-              <w:end w:w="120" w:type="dxa"/>
-            </w:tcMar>
-            <w:vAlign w:val="center"/>
-          </w:tcPr>
-          <w:p>
-            <w:r>
-              <w:rPr>
-                <w:rFonts w:ascii="Calibri" w:hAnsi="Calibri"/>
-                <w:color w:val="000000"/>
-                <w:sz w:val="21"/>
-              </w:rPr>
-              <w:t>$346,500 implied from a stated 6% down payment of $20,790.</w:t>
-            </w:r>
-          </w:p>
-        </w:tc>
-      </w:tr>
-      <w:tr>
-        <w:tc>
-          <w:tcPr>
-            <w:tcW w:type="dxa" w:w="2100"/>
-            <w:shd w:fill="F2F4F7"/>
-            <w:tcMar>
-              <w:top w:w="80" w:type="dxa"/>
-              <w:start w:w="120" w:type="dxa"/>
-              <w:bottom w:w="80" w:type="dxa"/>
-              <w:end w:w="120" w:type="dxa"/>
-            </w:tcMar>
-            <w:vAlign w:val="center"/>
-          </w:tcPr>
-          <w:p>
-            <w:r>
-              <w:rPr>
-                <w:rFonts w:ascii="Calibri" w:hAnsi="Calibri"/>
-                <w:b/>
-                <w:color w:val="000000"/>
-                <w:sz w:val="21"/>
-              </w:rPr>
-              <w:t>Proposed monthly payment</w:t>
-            </w:r>
-          </w:p>
-        </w:tc>
-        <w:tc>
-          <w:tcPr>
-            <w:tcW w:type="dxa" w:w="7260"/>
-            <w:tcMar>
-              <w:top w:w="80" w:type="dxa"/>
-              <w:start w:w="120" w:type="dxa"/>
-              <w:bottom w:w="80" w:type="dxa"/>
-              <w:end w:w="120" w:type="dxa"/>
-            </w:tcMar>
-            <w:vAlign w:val="center"/>
-          </w:tcPr>
-          <w:p>
-            <w:r>
-              <w:rPr>
-                <w:rFonts w:ascii="Calibri" w:hAnsi="Calibri"/>
-                <w:color w:val="000000"/>
-                <w:sz w:val="21"/>
-              </w:rPr>
-              <w:t>$2,701, described as including principal, interest, property taxes, and insurance escrow.</w:t>
-            </w:r>
-          </w:p>
-        </w:tc>
-      </w:tr>
-      <w:tr>
-        <w:tc>
-          <w:tcPr>
-            <w:tcW w:type="dxa" w:w="2100"/>
-            <w:shd w:fill="F2F4F7"/>
-            <w:tcMar>
-              <w:top w:w="80" w:type="dxa"/>
-              <w:start w:w="120" w:type="dxa"/>
-              <w:bottom w:w="80" w:type="dxa"/>
-              <w:end w:w="120" w:type="dxa"/>
-            </w:tcMar>
-            <w:vAlign w:val="center"/>
-          </w:tcPr>
-          <w:p>
-            <w:r>
-              <w:rPr>
-                <w:rFonts w:ascii="Calibri" w:hAnsi="Calibri"/>
-                <w:b/>
-                <w:color w:val="000000"/>
-                <w:sz w:val="21"/>
-              </w:rPr>
-              <w:t>Earnest money</w:t>
-            </w:r>
-          </w:p>
-        </w:tc>
-        <w:tc>
-          <w:tcPr>
-            <w:tcW w:type="dxa" w:w="7260"/>
-            <w:tcMar>
-              <w:top w:w="80" w:type="dxa"/>
-              <w:start w:w="120" w:type="dxa"/>
-              <w:bottom w:w="80" w:type="dxa"/>
-              <w:end w:w="120" w:type="dxa"/>
-            </w:tcMar>
-            <w:vAlign w:val="center"/>
-          </w:tcPr>
-          <w:p>
-            <w:r>
-              <w:rPr>
-                <w:rFonts w:ascii="Calibri" w:hAnsi="Calibri"/>
-                <w:color w:val="000000"/>
-                <w:sz w:val="21"/>
-              </w:rPr>
-              <w:t>$6,000 due at contract signing, with the remaining down payment due at attorney closing.</w:t>
-            </w:r>
-          </w:p>
-        </w:tc>
-      </w:tr>
-      <w:tr>
-        <w:tc>
-          <w:tcPr>
-            <w:tcW w:type="dxa" w:w="2100"/>
-            <w:shd w:fill="F2F4F7"/>
-            <w:tcMar>
-              <w:top w:w="80" w:type="dxa"/>
-              <w:start w:w="120" w:type="dxa"/>
-              <w:bottom w:w="80" w:type="dxa"/>
-              <w:end w:w="120" w:type="dxa"/>
-            </w:tcMar>
-            <w:vAlign w:val="center"/>
-          </w:tcPr>
-          <w:p>
-            <w:r>
-              <w:rPr>
-                <w:rFonts w:ascii="Calibri" w:hAnsi="Calibri"/>
-                <w:b/>
-                <w:color w:val="000000"/>
-                <w:sz w:val="21"/>
-              </w:rPr>
-              <w:t>Current rent</w:t>
-            </w:r>
-          </w:p>
-        </w:tc>
-        <w:tc>
-          <w:tcPr>
-            <w:tcW w:type="dxa" w:w="7260"/>
-            <w:tcMar>
-              <w:top w:w="80" w:type="dxa"/>
-              <w:start w:w="120" w:type="dxa"/>
-              <w:bottom w:w="80" w:type="dxa"/>
-              <w:end w:w="120" w:type="dxa"/>
-            </w:tcMar>
-            <w:vAlign w:val="center"/>
-          </w:tcPr>
-          <w:p>
-            <w:r>
-              <w:rPr>
-                <w:rFonts w:ascii="Calibri" w:hAnsi="Calibri"/>
-                <w:color w:val="000000"/>
-                <w:sz w:val="21"/>
-              </w:rPr>
-              <w:t>$1,885/month shown in applicant details.</w:t>
-            </w:r>
-          </w:p>
-        </w:tc>
-      </w:tr>
-      <w:tr>
-        <w:tc>
-          <w:tcPr>
-            <w:tcW w:type="dxa" w:w="2100"/>
-            <w:shd w:fill="F2F4F7"/>
-            <w:tcMar>
-              <w:top w:w="80" w:type="dxa"/>
-              <w:start w:w="120" w:type="dxa"/>
-              <w:bottom w:w="80" w:type="dxa"/>
-              <w:end w:w="120" w:type="dxa"/>
-            </w:tcMar>
-            <w:vAlign w:val="center"/>
-          </w:tcPr>
-          <w:p>
-            <w:r>
-              <w:rPr>
-                <w:rFonts w:ascii="Calibri" w:hAnsi="Calibri"/>
-                <w:b/>
-                <w:color w:val="000000"/>
-                <w:sz w:val="21"/>
-              </w:rPr>
-              <w:t>Occupancy/timing</w:t>
-            </w:r>
-          </w:p>
-        </w:tc>
-        <w:tc>
-          <w:tcPr>
-            <w:tcW w:type="dxa" w:w="7260"/>
-            <w:tcMar>
-              <w:top w:w="80" w:type="dxa"/>
-              <w:start w:w="120" w:type="dxa"/>
-              <w:bottom w:w="80" w:type="dxa"/>
-              <w:end w:w="120" w:type="dxa"/>
-            </w:tcMar>
-            <w:vAlign w:val="center"/>
-          </w:tcPr>
-          <w:p>
-            <w:r>
-              <w:rPr>
-                <w:rFonts w:ascii="Calibri" w:hAnsi="Calibri"/>
-                <w:color w:val="000000"/>
-                <w:sz w:val="21"/>
-              </w:rPr>
-              <w:t>Buyer currently occupies Tensity; lease was described as ending at the end of June 2026.</w:t>
-            </w:r>
-          </w:p>
-        </w:tc>
-      </w:tr>
-      <w:tr>
-        <w:tc>
-          <w:tcPr>
-            <w:tcW w:type="dxa" w:w="2100"/>
-            <w:shd w:fill="F2F4F7"/>
-            <w:tcMar>
-              <w:top w:w="80" w:type="dxa"/>
-              <w:start w:w="120" w:type="dxa"/>
-              <w:bottom w:w="80" w:type="dxa"/>
-              <w:end w:w="120" w:type="dxa"/>
-            </w:tcMar>
-            <w:vAlign w:val="center"/>
-          </w:tcPr>
-          <w:p>
-            <w:r>
-              <w:rPr>
-                <w:rFonts w:ascii="Calibri" w:hAnsi="Calibri"/>
-                <w:b/>
-                <w:color w:val="000000"/>
-                <w:sz w:val="21"/>
-              </w:rPr>
-              <w:t>Structure still unresolved</w:t>
-            </w:r>
-          </w:p>
-        </w:tc>
-        <w:tc>
-          <w:tcPr>
-            <w:tcW w:type="dxa" w:w="7260"/>
-            <w:tcMar>
-              <w:top w:w="80" w:type="dxa"/>
-              <w:start w:w="120" w:type="dxa"/>
-              <w:bottom w:w="80" w:type="dxa"/>
-              <w:end w:w="120" w:type="dxa"/>
-            </w:tcMar>
-            <w:vAlign w:val="center"/>
-          </w:tcPr>
-          <w:p>
-            <w:r>
-              <w:rPr>
-                <w:rFonts w:ascii="Calibri" w:hAnsi="Calibri"/>
-                <w:color w:val="000000"/>
-                <w:sz w:val="21"/>
-              </w:rPr>
-              <w:t>Meeting materials use mixed language about note/mortgage-style financing and deed-transfer-after-payoff structure.</w:t>
-            </w:r>
-          </w:p>
-        </w:tc>
-      </w:tr>
-    </w:tbl>
-    <w:p>
-      <w:pPr>
-        <w:spacing w:after="40"/>
-      </w:pPr>
-    </w:p>
-    <w:p>
-      <w:pPr>
-        <w:pStyle w:val="Heading1"/>
-        <w:keepNext/>
-        <w:spacing w:before="320" w:after="160"/>
-      </w:pPr>
-      <w:r>
-        <w:rPr>
-          <w:rFonts w:ascii="Calibri" w:hAnsi="Calibri"/>
-          <w:b/>
+          <w:i w:val="0"/>
           <w:color w:val="2E74B5"/>
           <w:sz w:val="32"/>
         </w:rPr>
@@ -1041,12 +913,14 @@
     <w:p>
       <w:pPr>
         <w:pStyle w:val="ListBullet"/>
-        <w:spacing w:after="160" w:line="280" w:lineRule="auto"/>
+        <w:spacing w:after="140" w:line="280" w:lineRule="auto"/>
         <w:ind w:left="720" w:hanging="360"/>
       </w:pPr>
       <w:r>
         <w:rPr>
           <w:rFonts w:ascii="Calibri" w:hAnsi="Calibri"/>
+          <w:b w:val="0"/>
+          <w:i w:val="0"/>
           <w:color w:val="000000"/>
           <w:sz w:val="22"/>
         </w:rPr>
@@ -1056,12 +930,14 @@
     <w:p>
       <w:pPr>
         <w:pStyle w:val="ListBullet"/>
-        <w:spacing w:after="160" w:line="280" w:lineRule="auto"/>
+        <w:spacing w:after="140" w:line="280" w:lineRule="auto"/>
         <w:ind w:left="720" w:hanging="360"/>
       </w:pPr>
       <w:r>
         <w:rPr>
           <w:rFonts w:ascii="Calibri" w:hAnsi="Calibri"/>
+          <w:b w:val="0"/>
+          <w:i w:val="0"/>
           <w:color w:val="000000"/>
           <w:sz w:val="22"/>
         </w:rPr>
@@ -1071,12 +947,14 @@
     <w:p>
       <w:pPr>
         <w:pStyle w:val="ListBullet"/>
-        <w:spacing w:after="160" w:line="280" w:lineRule="auto"/>
+        <w:spacing w:after="140" w:line="280" w:lineRule="auto"/>
         <w:ind w:left="720" w:hanging="360"/>
       </w:pPr>
       <w:r>
         <w:rPr>
           <w:rFonts w:ascii="Calibri" w:hAnsi="Calibri"/>
+          <w:b w:val="0"/>
+          <w:i w:val="0"/>
           <w:color w:val="000000"/>
           <w:sz w:val="22"/>
         </w:rPr>
@@ -1086,16 +964,35 @@
     <w:p>
       <w:pPr>
         <w:pStyle w:val="ListBullet"/>
-        <w:spacing w:after="160" w:line="280" w:lineRule="auto"/>
+        <w:spacing w:after="140" w:line="280" w:lineRule="auto"/>
         <w:ind w:left="720" w:hanging="360"/>
       </w:pPr>
       <w:r>
         <w:rPr>
           <w:rFonts w:ascii="Calibri" w:hAnsi="Calibri"/>
+          <w:b w:val="0"/>
+          <w:i w:val="0"/>
           <w:color w:val="000000"/>
           <w:sz w:val="22"/>
         </w:rPr>
         <w:t>Background check reports no housing court records and no criminal records.</w:t>
+      </w:r>
+    </w:p>
+    <w:p>
+      <w:pPr>
+        <w:pStyle w:val="ListBullet"/>
+        <w:spacing w:after="140" w:line="280" w:lineRule="auto"/>
+        <w:ind w:left="720" w:hanging="360"/>
+      </w:pPr>
+      <w:r>
+        <w:rPr>
+          <w:rFonts w:ascii="Calibri" w:hAnsi="Calibri"/>
+          <w:b w:val="0"/>
+          <w:i w:val="0"/>
+          <w:color w:val="000000"/>
+          <w:sz w:val="22"/>
+        </w:rPr>
+        <w:t>Rent verification letter supports timely rent payments during the tenancy.</w:t>
       </w:r>
     </w:p>
     <w:p>
@@ -1108,6 +1005,7 @@
         <w:rPr>
           <w:rFonts w:ascii="Calibri" w:hAnsi="Calibri"/>
           <w:b/>
+          <w:i w:val="0"/>
           <w:color w:val="2E74B5"/>
           <w:sz w:val="32"/>
         </w:rPr>
@@ -1118,16 +1016,17 @@
       <w:pPr>
         <w:pStyle w:val="Heading2"/>
         <w:keepNext/>
-        <w:spacing w:before="240" w:after="120"/>
+        <w:spacing w:before="200" w:after="100"/>
       </w:pPr>
       <w:r>
         <w:rPr>
           <w:rFonts w:ascii="Calibri" w:hAnsi="Calibri"/>
           <w:b/>
+          <w:i w:val="0"/>
           <w:color w:val="2E74B5"/>
           <w:sz w:val="26"/>
         </w:rPr>
-        <w:t>Income Verification</w:t>
+        <w:t>Income And Business Cash Flow</w:t>
       </w:r>
     </w:p>
     <w:p>
@@ -1138,36 +1037,450 @@
         <w:rPr>
           <w:rFonts w:ascii="Calibri" w:hAnsi="Calibri"/>
           <w:b w:val="0"/>
+          <w:i w:val="0"/>
           <w:color w:val="000000"/>
           <w:sz w:val="22"/>
         </w:rPr>
-        <w:t>Applicant details state self-employment income of $9,500/month. That figure is self-reported and is not supported in the refreshed folder by tax returns, a year-to-date profit-and-loss statement, 1099s, invoices, contracts, employer/customer verification, or current 2026 bank statements.</w:t>
+        <w:t>Applicant details state self-employment income of $9,500/month. The new Matthew Flooring LLC business statements now support active business cash flow, but they do not verify personal net income without tax returns, a profit-and-loss statement, ownership/compensation records, and owner-draw analysis.</w:t>
       </w:r>
     </w:p>
     <w:p>
+      <w:r>
+        <w:br w:type="page"/>
+      </w:r>
+    </w:p>
+    <w:tbl>
+      <w:tblPr>
+        <w:tblStyle w:val="TableGrid"/>
+        <w:tblW w:type="auto" w:w="0"/>
+        <w:jc w:val="left"/>
+        <w:tblLayout w:type="fixed"/>
+        <w:tblLook w:firstColumn="1" w:firstRow="1" w:lastColumn="0" w:lastRow="0" w:noHBand="0" w:noVBand="1" w:val="04A0"/>
+        <w:tblW w:w="9360" w:type="dxa"/>
+        <w:tblInd w:w="120" w:type="dxa"/>
+      </w:tblPr>
+      <w:tblGrid>
+        <w:gridCol w:w="2300"/>
+        <w:gridCol w:w="7060"/>
+      </w:tblGrid>
+      <w:tr>
+        <w:tc>
+          <w:tcPr>
+            <w:tcW w:type="dxa" w:w="9360"/>
+            <w:gridSpan w:val="2"/>
+            <w:shd w:fill="F2F4F7"/>
+            <w:tcW w:w="2300" w:type="dxa"/>
+            <w:vAlign w:val="center"/>
+            <w:tcMar>
+              <w:top w:w="80" w:type="dxa"/>
+              <w:bottom w:w="80" w:type="dxa"/>
+              <w:start w:w="120" w:type="dxa"/>
+              <w:end w:w="120" w:type="dxa"/>
+            </w:tcMar>
+            <w:tcW w:w="7060" w:type="dxa"/>
+          </w:tcPr>
+          <w:p>
+            <w:r>
+              <w:rPr>
+                <w:rFonts w:ascii="Calibri" w:hAnsi="Calibri"/>
+                <w:b/>
+                <w:i w:val="0"/>
+                <w:color w:val="000000"/>
+                <w:sz w:val="21"/>
+              </w:rPr>
+              <w:t>Business Statement Summary</w:t>
+            </w:r>
+          </w:p>
+        </w:tc>
+      </w:tr>
+      <w:tr>
+        <w:tc>
+          <w:tcPr>
+            <w:tcW w:type="dxa" w:w="4680"/>
+            <w:shd w:fill="F2F4F7"/>
+            <w:tcW w:w="2300" w:type="dxa"/>
+            <w:vAlign w:val="center"/>
+            <w:tcMar>
+              <w:top w:w="80" w:type="dxa"/>
+              <w:bottom w:w="80" w:type="dxa"/>
+              <w:start w:w="120" w:type="dxa"/>
+              <w:end w:w="120" w:type="dxa"/>
+            </w:tcMar>
+          </w:tcPr>
+          <w:p>
+            <w:r>
+              <w:rPr>
+                <w:rFonts w:ascii="Calibri" w:hAnsi="Calibri"/>
+                <w:b/>
+                <w:i w:val="0"/>
+                <w:color w:val="000000"/>
+                <w:sz w:val="21"/>
+              </w:rPr>
+              <w:t>Unique business statements reviewed</w:t>
+            </w:r>
+          </w:p>
+        </w:tc>
+        <w:tc>
+          <w:tcPr>
+            <w:tcW w:type="dxa" w:w="4680"/>
+            <w:tcW w:w="7060" w:type="dxa"/>
+            <w:vAlign w:val="center"/>
+            <w:tcMar>
+              <w:top w:w="80" w:type="dxa"/>
+              <w:bottom w:w="80" w:type="dxa"/>
+              <w:start w:w="120" w:type="dxa"/>
+              <w:end w:w="120" w:type="dxa"/>
+            </w:tcMar>
+          </w:tcPr>
+          <w:p>
+            <w:r>
+              <w:rPr>
+                <w:rFonts w:ascii="Calibri" w:hAnsi="Calibri"/>
+                <w:b w:val="0"/>
+                <w:i w:val="0"/>
+                <w:color w:val="000000"/>
+                <w:sz w:val="21"/>
+              </w:rPr>
+              <w:t>16 unique statements; one August/September 2025 business statement appears duplicated or mislabeled.</w:t>
+            </w:r>
+          </w:p>
+        </w:tc>
+      </w:tr>
+      <w:tr>
+        <w:tc>
+          <w:tcPr>
+            <w:tcW w:type="dxa" w:w="4680"/>
+            <w:shd w:fill="F2F4F7"/>
+            <w:tcW w:w="2300" w:type="dxa"/>
+            <w:vAlign w:val="center"/>
+            <w:tcMar>
+              <w:top w:w="80" w:type="dxa"/>
+              <w:bottom w:w="80" w:type="dxa"/>
+              <w:start w:w="120" w:type="dxa"/>
+              <w:end w:w="120" w:type="dxa"/>
+            </w:tcMar>
+          </w:tcPr>
+          <w:p>
+            <w:r>
+              <w:rPr>
+                <w:rFonts w:ascii="Calibri" w:hAnsi="Calibri"/>
+                <w:b/>
+                <w:i w:val="0"/>
+                <w:color w:val="000000"/>
+                <w:sz w:val="21"/>
+              </w:rPr>
+              <w:t>Business deposits/credits</w:t>
+            </w:r>
+          </w:p>
+        </w:tc>
+        <w:tc>
+          <w:tcPr>
+            <w:tcW w:type="dxa" w:w="4680"/>
+            <w:tcW w:w="7060" w:type="dxa"/>
+            <w:vAlign w:val="center"/>
+            <w:tcMar>
+              <w:top w:w="80" w:type="dxa"/>
+              <w:bottom w:w="80" w:type="dxa"/>
+              <w:start w:w="120" w:type="dxa"/>
+              <w:end w:w="120" w:type="dxa"/>
+            </w:tcMar>
+          </w:tcPr>
+          <w:p>
+            <w:r>
+              <w:rPr>
+                <w:rFonts w:ascii="Calibri" w:hAnsi="Calibri"/>
+                <w:b w:val="0"/>
+                <w:i w:val="0"/>
+                <w:color w:val="000000"/>
+                <w:sz w:val="21"/>
+              </w:rPr>
+              <w:t>$434,462.90 total; $27,153.93 average per month.</w:t>
+            </w:r>
+          </w:p>
+        </w:tc>
+      </w:tr>
+      <w:tr>
+        <w:tc>
+          <w:tcPr>
+            <w:tcW w:type="dxa" w:w="4680"/>
+            <w:shd w:fill="F2F4F7"/>
+            <w:tcW w:w="2300" w:type="dxa"/>
+            <w:vAlign w:val="center"/>
+            <w:tcMar>
+              <w:top w:w="80" w:type="dxa"/>
+              <w:bottom w:w="80" w:type="dxa"/>
+              <w:start w:w="120" w:type="dxa"/>
+              <w:end w:w="120" w:type="dxa"/>
+            </w:tcMar>
+          </w:tcPr>
+          <w:p>
+            <w:r>
+              <w:rPr>
+                <w:rFonts w:ascii="Calibri" w:hAnsi="Calibri"/>
+                <w:b/>
+                <w:i w:val="0"/>
+                <w:color w:val="000000"/>
+                <w:sz w:val="21"/>
+              </w:rPr>
+              <w:t>Business withdrawals/debits</w:t>
+            </w:r>
+          </w:p>
+        </w:tc>
+        <w:tc>
+          <w:tcPr>
+            <w:tcW w:type="dxa" w:w="4680"/>
+            <w:tcW w:w="7060" w:type="dxa"/>
+            <w:vAlign w:val="center"/>
+            <w:tcMar>
+              <w:top w:w="80" w:type="dxa"/>
+              <w:bottom w:w="80" w:type="dxa"/>
+              <w:start w:w="120" w:type="dxa"/>
+              <w:end w:w="120" w:type="dxa"/>
+            </w:tcMar>
+          </w:tcPr>
+          <w:p>
+            <w:r>
+              <w:rPr>
+                <w:rFonts w:ascii="Calibri" w:hAnsi="Calibri"/>
+                <w:b w:val="0"/>
+                <w:i w:val="0"/>
+                <w:color w:val="000000"/>
+                <w:sz w:val="21"/>
+              </w:rPr>
+              <w:t>$433,300.52 total; $27,081.28 average per month.</w:t>
+            </w:r>
+          </w:p>
+        </w:tc>
+      </w:tr>
+      <w:tr>
+        <w:tc>
+          <w:tcPr>
+            <w:tcW w:type="dxa" w:w="4680"/>
+            <w:shd w:fill="F2F4F7"/>
+            <w:tcW w:w="2300" w:type="dxa"/>
+            <w:vAlign w:val="center"/>
+            <w:tcMar>
+              <w:top w:w="80" w:type="dxa"/>
+              <w:bottom w:w="80" w:type="dxa"/>
+              <w:start w:w="120" w:type="dxa"/>
+              <w:end w:w="120" w:type="dxa"/>
+            </w:tcMar>
+          </w:tcPr>
+          <w:p>
+            <w:r>
+              <w:rPr>
+                <w:rFonts w:ascii="Calibri" w:hAnsi="Calibri"/>
+                <w:b/>
+                <w:i w:val="0"/>
+                <w:color w:val="000000"/>
+                <w:sz w:val="21"/>
+              </w:rPr>
+              <w:t>Average monthly net account increase</w:t>
+            </w:r>
+          </w:p>
+        </w:tc>
+        <w:tc>
+          <w:tcPr>
+            <w:tcW w:type="dxa" w:w="4680"/>
+            <w:tcW w:w="7060" w:type="dxa"/>
+            <w:vAlign w:val="center"/>
+            <w:tcMar>
+              <w:top w:w="80" w:type="dxa"/>
+              <w:bottom w:w="80" w:type="dxa"/>
+              <w:start w:w="120" w:type="dxa"/>
+              <w:end w:w="120" w:type="dxa"/>
+            </w:tcMar>
+          </w:tcPr>
+          <w:p>
+            <w:r>
+              <w:rPr>
+                <w:rFonts w:ascii="Calibri" w:hAnsi="Calibri"/>
+                <w:b w:val="0"/>
+                <w:i w:val="0"/>
+                <w:color w:val="000000"/>
+                <w:sz w:val="21"/>
+              </w:rPr>
+              <w:t>$72.65 across the unique business statement set.</w:t>
+            </w:r>
+          </w:p>
+        </w:tc>
+      </w:tr>
+      <w:tr>
+        <w:tc>
+          <w:tcPr>
+            <w:tcW w:type="dxa" w:w="4680"/>
+            <w:shd w:fill="F2F4F7"/>
+            <w:tcW w:w="2300" w:type="dxa"/>
+            <w:vAlign w:val="center"/>
+            <w:tcMar>
+              <w:top w:w="80" w:type="dxa"/>
+              <w:bottom w:w="80" w:type="dxa"/>
+              <w:start w:w="120" w:type="dxa"/>
+              <w:end w:w="120" w:type="dxa"/>
+            </w:tcMar>
+          </w:tcPr>
+          <w:p>
+            <w:r>
+              <w:rPr>
+                <w:rFonts w:ascii="Calibri" w:hAnsi="Calibri"/>
+                <w:b/>
+                <w:i w:val="0"/>
+                <w:color w:val="000000"/>
+                <w:sz w:val="21"/>
+              </w:rPr>
+              <w:t>2026 business average deposits</w:t>
+            </w:r>
+          </w:p>
+        </w:tc>
+        <w:tc>
+          <w:tcPr>
+            <w:tcW w:type="dxa" w:w="4680"/>
+            <w:tcW w:w="7060" w:type="dxa"/>
+            <w:vAlign w:val="center"/>
+            <w:tcMar>
+              <w:top w:w="80" w:type="dxa"/>
+              <w:bottom w:w="80" w:type="dxa"/>
+              <w:start w:w="120" w:type="dxa"/>
+              <w:end w:w="120" w:type="dxa"/>
+            </w:tcMar>
+          </w:tcPr>
+          <w:p>
+            <w:r>
+              <w:rPr>
+                <w:rFonts w:ascii="Calibri" w:hAnsi="Calibri"/>
+                <w:b w:val="0"/>
+                <w:i w:val="0"/>
+                <w:color w:val="000000"/>
+                <w:sz w:val="21"/>
+              </w:rPr>
+              <w:t>$24,631.93/month from January through May 2026.</w:t>
+            </w:r>
+          </w:p>
+        </w:tc>
+      </w:tr>
+      <w:tr>
+        <w:tc>
+          <w:tcPr>
+            <w:tcW w:type="dxa" w:w="4680"/>
+            <w:shd w:fill="F2F4F7"/>
+            <w:tcW w:w="2300" w:type="dxa"/>
+            <w:vAlign w:val="center"/>
+            <w:tcMar>
+              <w:top w:w="80" w:type="dxa"/>
+              <w:bottom w:w="80" w:type="dxa"/>
+              <w:start w:w="120" w:type="dxa"/>
+              <w:end w:w="120" w:type="dxa"/>
+            </w:tcMar>
+          </w:tcPr>
+          <w:p>
+            <w:r>
+              <w:rPr>
+                <w:rFonts w:ascii="Calibri" w:hAnsi="Calibri"/>
+                <w:b/>
+                <w:i w:val="0"/>
+                <w:color w:val="000000"/>
+                <w:sz w:val="21"/>
+              </w:rPr>
+              <w:t>2026 business average net increase</w:t>
+            </w:r>
+          </w:p>
+        </w:tc>
+        <w:tc>
+          <w:tcPr>
+            <w:tcW w:type="dxa" w:w="4680"/>
+            <w:tcW w:w="7060" w:type="dxa"/>
+            <w:vAlign w:val="center"/>
+            <w:tcMar>
+              <w:top w:w="80" w:type="dxa"/>
+              <w:bottom w:w="80" w:type="dxa"/>
+              <w:start w:w="120" w:type="dxa"/>
+              <w:end w:w="120" w:type="dxa"/>
+            </w:tcMar>
+          </w:tcPr>
+          <w:p>
+            <w:r>
+              <w:rPr>
+                <w:rFonts w:ascii="Calibri" w:hAnsi="Calibri"/>
+                <w:b w:val="0"/>
+                <w:i w:val="0"/>
+                <w:color w:val="000000"/>
+                <w:sz w:val="21"/>
+              </w:rPr>
+              <w:t>$528.82/month from January through May 2026.</w:t>
+            </w:r>
+          </w:p>
+        </w:tc>
+      </w:tr>
+      <w:tr>
+        <w:tc>
+          <w:tcPr>
+            <w:tcW w:type="dxa" w:w="4680"/>
+            <w:shd w:fill="F2F4F7"/>
+            <w:tcW w:w="2300" w:type="dxa"/>
+            <w:vAlign w:val="center"/>
+            <w:tcMar>
+              <w:top w:w="80" w:type="dxa"/>
+              <w:bottom w:w="80" w:type="dxa"/>
+              <w:start w:w="120" w:type="dxa"/>
+              <w:end w:w="120" w:type="dxa"/>
+            </w:tcMar>
+          </w:tcPr>
+          <w:p>
+            <w:r>
+              <w:rPr>
+                <w:rFonts w:ascii="Calibri" w:hAnsi="Calibri"/>
+                <w:b/>
+                <w:i w:val="0"/>
+                <w:color w:val="000000"/>
+                <w:sz w:val="21"/>
+              </w:rPr>
+              <w:t>Latest business ending balance</w:t>
+            </w:r>
+          </w:p>
+        </w:tc>
+        <w:tc>
+          <w:tcPr>
+            <w:tcW w:type="dxa" w:w="4680"/>
+            <w:tcW w:w="7060" w:type="dxa"/>
+            <w:vAlign w:val="center"/>
+            <w:tcMar>
+              <w:top w:w="80" w:type="dxa"/>
+              <w:bottom w:w="80" w:type="dxa"/>
+              <w:start w:w="120" w:type="dxa"/>
+              <w:end w:w="120" w:type="dxa"/>
+            </w:tcMar>
+          </w:tcPr>
+          <w:p>
+            <w:r>
+              <w:rPr>
+                <w:rFonts w:ascii="Calibri" w:hAnsi="Calibri"/>
+                <w:b w:val="0"/>
+                <w:i w:val="0"/>
+                <w:color w:val="000000"/>
+                <w:sz w:val="21"/>
+              </w:rPr>
+              <w:t>$5,058.11 on the May 31, 2026 statement.</w:t>
+            </w:r>
+          </w:p>
+        </w:tc>
+      </w:tr>
+    </w:tbl>
+    <w:p>
       <w:pPr>
-        <w:spacing w:before="0" w:after="120" w:line="264" w:lineRule="auto"/>
+        <w:spacing w:before="0" w:after="40" w:line="264" w:lineRule="auto"/>
       </w:pPr>
-      <w:r>
-        <w:rPr>
-          <w:rFonts w:ascii="Calibri" w:hAnsi="Calibri"/>
-          <w:b w:val="0"/>
-          <w:color w:val="000000"/>
-          <w:sz w:val="22"/>
-        </w:rPr>
-        <w:t>The Wells Fargo statements do not verify $9,500/month in current income. They cover mostly 2025 statement periods, with the latest provided statement ending December 5, 2025, roughly six months before the June 2026 application. Ordinary-month deposits are materially lower than the stated income. The September 9, 2025 through October 7, 2025 statement shows $9,891 in deposits, but much of that activity appears to be Zelle transfer activity from Kimberly Terrill and related outgoing transfers rather than clearly documented recurring business income.</w:t>
-      </w:r>
     </w:p>
     <w:p>
       <w:pPr>
         <w:pStyle w:val="Heading2"/>
         <w:keepNext/>
-        <w:spacing w:before="240" w:after="120"/>
+        <w:spacing w:before="200" w:after="100"/>
       </w:pPr>
       <w:r>
         <w:rPr>
           <w:rFonts w:ascii="Calibri" w:hAnsi="Calibri"/>
           <w:b/>
+          <w:i w:val="0"/>
           <w:color w:val="2E74B5"/>
           <w:sz w:val="26"/>
         </w:rPr>
@@ -1177,35 +1490,39 @@
     <w:tbl>
       <w:tblPr>
         <w:tblStyle w:val="TableGrid"/>
-        <w:tblW w:type="dxa" w:w="9360"/>
+        <w:tblW w:type="auto" w:w="0"/>
         <w:jc w:val="left"/>
         <w:tblLayout w:type="fixed"/>
         <w:tblLook w:firstColumn="1" w:firstRow="1" w:lastColumn="0" w:lastRow="0" w:noHBand="0" w:noVBand="1" w:val="04A0"/>
+        <w:tblW w:w="9360" w:type="dxa"/>
         <w:tblInd w:w="120" w:type="dxa"/>
       </w:tblPr>
       <w:tblGrid>
-        <w:gridCol w:w="2100"/>
-        <w:gridCol w:w="7260"/>
+        <w:gridCol w:w="2300"/>
+        <w:gridCol w:w="7060"/>
       </w:tblGrid>
       <w:tr>
         <w:tc>
           <w:tcPr>
-            <w:tcW w:type="dxa" w:w="7260"/>
+            <w:tcW w:type="dxa" w:w="9360"/>
             <w:gridSpan w:val="2"/>
             <w:shd w:fill="F2F4F7"/>
+            <w:tcW w:w="2300" w:type="dxa"/>
+            <w:vAlign w:val="center"/>
             <w:tcMar>
               <w:top w:w="80" w:type="dxa"/>
+              <w:bottom w:w="80" w:type="dxa"/>
               <w:start w:w="120" w:type="dxa"/>
-              <w:bottom w:w="80" w:type="dxa"/>
               <w:end w:w="120" w:type="dxa"/>
             </w:tcMar>
-            <w:vAlign w:val="center"/>
+            <w:tcW w:w="7060" w:type="dxa"/>
           </w:tcPr>
           <w:p>
             <w:r>
               <w:rPr>
                 <w:rFonts w:ascii="Calibri" w:hAnsi="Calibri"/>
                 <w:b/>
+                <w:i w:val="0"/>
                 <w:color w:val="000000"/>
                 <w:sz w:val="21"/>
               </w:rPr>
@@ -1217,21 +1534,23 @@
       <w:tr>
         <w:tc>
           <w:tcPr>
-            <w:tcW w:type="dxa" w:w="2100"/>
+            <w:tcW w:type="dxa" w:w="4680"/>
             <w:shd w:fill="F2F4F7"/>
+            <w:tcW w:w="2300" w:type="dxa"/>
+            <w:vAlign w:val="center"/>
             <w:tcMar>
               <w:top w:w="80" w:type="dxa"/>
+              <w:bottom w:w="80" w:type="dxa"/>
               <w:start w:w="120" w:type="dxa"/>
-              <w:bottom w:w="80" w:type="dxa"/>
               <w:end w:w="120" w:type="dxa"/>
             </w:tcMar>
-            <w:vAlign w:val="center"/>
           </w:tcPr>
           <w:p>
             <w:r>
               <w:rPr>
                 <w:rFonts w:ascii="Calibri" w:hAnsi="Calibri"/>
                 <w:b/>
+                <w:i w:val="0"/>
                 <w:color w:val="000000"/>
                 <w:sz w:val="21"/>
               </w:rPr>
@@ -1241,19 +1560,22 @@
         </w:tc>
         <w:tc>
           <w:tcPr>
-            <w:tcW w:type="dxa" w:w="7260"/>
+            <w:tcW w:type="dxa" w:w="4680"/>
+            <w:tcW w:w="7060" w:type="dxa"/>
+            <w:vAlign w:val="center"/>
             <w:tcMar>
               <w:top w:w="80" w:type="dxa"/>
+              <w:bottom w:w="80" w:type="dxa"/>
               <w:start w:w="120" w:type="dxa"/>
-              <w:bottom w:w="80" w:type="dxa"/>
               <w:end w:w="120" w:type="dxa"/>
             </w:tcMar>
-            <w:vAlign w:val="center"/>
           </w:tcPr>
           <w:p>
             <w:r>
               <w:rPr>
                 <w:rFonts w:ascii="Calibri" w:hAnsi="Calibri"/>
+                <w:b w:val="0"/>
+                <w:i w:val="0"/>
                 <w:color w:val="000000"/>
                 <w:sz w:val="21"/>
               </w:rPr>
@@ -1265,21 +1587,23 @@
       <w:tr>
         <w:tc>
           <w:tcPr>
-            <w:tcW w:type="dxa" w:w="2100"/>
+            <w:tcW w:type="dxa" w:w="4680"/>
             <w:shd w:fill="F2F4F7"/>
+            <w:tcW w:w="2300" w:type="dxa"/>
+            <w:vAlign w:val="center"/>
             <w:tcMar>
               <w:top w:w="80" w:type="dxa"/>
+              <w:bottom w:w="80" w:type="dxa"/>
               <w:start w:w="120" w:type="dxa"/>
-              <w:bottom w:w="80" w:type="dxa"/>
               <w:end w:w="120" w:type="dxa"/>
             </w:tcMar>
-            <w:vAlign w:val="center"/>
           </w:tcPr>
           <w:p>
             <w:r>
               <w:rPr>
                 <w:rFonts w:ascii="Calibri" w:hAnsi="Calibri"/>
                 <w:b/>
+                <w:i w:val="0"/>
                 <w:color w:val="000000"/>
                 <w:sz w:val="21"/>
               </w:rPr>
@@ -1289,19 +1613,22 @@
         </w:tc>
         <w:tc>
           <w:tcPr>
-            <w:tcW w:type="dxa" w:w="7260"/>
+            <w:tcW w:type="dxa" w:w="4680"/>
+            <w:tcW w:w="7060" w:type="dxa"/>
+            <w:vAlign w:val="center"/>
             <w:tcMar>
               <w:top w:w="80" w:type="dxa"/>
+              <w:bottom w:w="80" w:type="dxa"/>
               <w:start w:w="120" w:type="dxa"/>
-              <w:bottom w:w="80" w:type="dxa"/>
               <w:end w:w="120" w:type="dxa"/>
             </w:tcMar>
-            <w:vAlign w:val="center"/>
           </w:tcPr>
           <w:p>
             <w:r>
               <w:rPr>
                 <w:rFonts w:ascii="Calibri" w:hAnsi="Calibri"/>
+                <w:b w:val="0"/>
+                <w:i w:val="0"/>
                 <w:color w:val="000000"/>
                 <w:sz w:val="21"/>
               </w:rPr>
@@ -1313,21 +1640,23 @@
       <w:tr>
         <w:tc>
           <w:tcPr>
-            <w:tcW w:type="dxa" w:w="2100"/>
+            <w:tcW w:type="dxa" w:w="4680"/>
             <w:shd w:fill="F2F4F7"/>
+            <w:tcW w:w="2300" w:type="dxa"/>
+            <w:vAlign w:val="center"/>
             <w:tcMar>
               <w:top w:w="80" w:type="dxa"/>
+              <w:bottom w:w="80" w:type="dxa"/>
               <w:start w:w="120" w:type="dxa"/>
-              <w:bottom w:w="80" w:type="dxa"/>
               <w:end w:w="120" w:type="dxa"/>
             </w:tcMar>
-            <w:vAlign w:val="center"/>
           </w:tcPr>
           <w:p>
             <w:r>
               <w:rPr>
                 <w:rFonts w:ascii="Calibri" w:hAnsi="Calibri"/>
                 <w:b/>
+                <w:i w:val="0"/>
                 <w:color w:val="000000"/>
                 <w:sz w:val="21"/>
               </w:rPr>
@@ -1337,19 +1666,22 @@
         </w:tc>
         <w:tc>
           <w:tcPr>
-            <w:tcW w:type="dxa" w:w="7260"/>
+            <w:tcW w:type="dxa" w:w="4680"/>
+            <w:tcW w:w="7060" w:type="dxa"/>
+            <w:vAlign w:val="center"/>
             <w:tcMar>
               <w:top w:w="80" w:type="dxa"/>
+              <w:bottom w:w="80" w:type="dxa"/>
               <w:start w:w="120" w:type="dxa"/>
-              <w:bottom w:w="80" w:type="dxa"/>
               <w:end w:w="120" w:type="dxa"/>
             </w:tcMar>
-            <w:vAlign w:val="center"/>
           </w:tcPr>
           <w:p>
             <w:r>
               <w:rPr>
                 <w:rFonts w:ascii="Calibri" w:hAnsi="Calibri"/>
+                <w:b w:val="0"/>
+                <w:i w:val="0"/>
                 <w:color w:val="000000"/>
                 <w:sz w:val="21"/>
               </w:rPr>
@@ -1361,21 +1693,23 @@
       <w:tr>
         <w:tc>
           <w:tcPr>
-            <w:tcW w:type="dxa" w:w="2100"/>
+            <w:tcW w:type="dxa" w:w="4680"/>
             <w:shd w:fill="F2F4F7"/>
+            <w:tcW w:w="2300" w:type="dxa"/>
+            <w:vAlign w:val="center"/>
             <w:tcMar>
               <w:top w:w="80" w:type="dxa"/>
+              <w:bottom w:w="80" w:type="dxa"/>
               <w:start w:w="120" w:type="dxa"/>
-              <w:bottom w:w="80" w:type="dxa"/>
               <w:end w:w="120" w:type="dxa"/>
             </w:tcMar>
-            <w:vAlign w:val="center"/>
           </w:tcPr>
           <w:p>
             <w:r>
               <w:rPr>
                 <w:rFonts w:ascii="Calibri" w:hAnsi="Calibri"/>
                 <w:b/>
+                <w:i w:val="0"/>
                 <w:color w:val="000000"/>
                 <w:sz w:val="21"/>
               </w:rPr>
@@ -1385,19 +1719,22 @@
         </w:tc>
         <w:tc>
           <w:tcPr>
-            <w:tcW w:type="dxa" w:w="7260"/>
+            <w:tcW w:type="dxa" w:w="4680"/>
+            <w:tcW w:w="7060" w:type="dxa"/>
+            <w:vAlign w:val="center"/>
             <w:tcMar>
               <w:top w:w="80" w:type="dxa"/>
+              <w:bottom w:w="80" w:type="dxa"/>
               <w:start w:w="120" w:type="dxa"/>
-              <w:bottom w:w="80" w:type="dxa"/>
               <w:end w:w="120" w:type="dxa"/>
             </w:tcMar>
-            <w:vAlign w:val="center"/>
           </w:tcPr>
           <w:p>
             <w:r>
               <w:rPr>
                 <w:rFonts w:ascii="Calibri" w:hAnsi="Calibri"/>
+                <w:b w:val="0"/>
+                <w:i w:val="0"/>
                 <w:color w:val="000000"/>
                 <w:sz w:val="21"/>
               </w:rPr>
@@ -1409,19 +1746,25 @@
     </w:tbl>
     <w:p>
       <w:pPr>
-        <w:spacing w:after="40"/>
+        <w:spacing w:before="0" w:after="40" w:line="264" w:lineRule="auto"/>
       </w:pPr>
+    </w:p>
+    <w:p>
+      <w:r>
+        <w:br w:type="page"/>
+      </w:r>
     </w:p>
     <w:p>
       <w:pPr>
         <w:pStyle w:val="Heading2"/>
         <w:keepNext/>
-        <w:spacing w:before="240" w:after="120"/>
+        <w:spacing w:before="200" w:after="100"/>
       </w:pPr>
       <w:r>
         <w:rPr>
           <w:rFonts w:ascii="Calibri" w:hAnsi="Calibri"/>
           <w:b/>
+          <w:i w:val="0"/>
           <w:color w:val="2E74B5"/>
           <w:sz w:val="26"/>
         </w:rPr>
@@ -1431,35 +1774,39 @@
     <w:tbl>
       <w:tblPr>
         <w:tblStyle w:val="TableGrid"/>
-        <w:tblW w:type="dxa" w:w="9360"/>
+        <w:tblW w:type="auto" w:w="0"/>
         <w:jc w:val="left"/>
         <w:tblLayout w:type="fixed"/>
         <w:tblLook w:firstColumn="1" w:firstRow="1" w:lastColumn="0" w:lastRow="0" w:noHBand="0" w:noVBand="1" w:val="04A0"/>
+        <w:tblW w:w="9360" w:type="dxa"/>
         <w:tblInd w:w="120" w:type="dxa"/>
       </w:tblPr>
       <w:tblGrid>
-        <w:gridCol w:w="2100"/>
-        <w:gridCol w:w="7260"/>
+        <w:gridCol w:w="2300"/>
+        <w:gridCol w:w="7060"/>
       </w:tblGrid>
       <w:tr>
         <w:tc>
           <w:tcPr>
-            <w:tcW w:type="dxa" w:w="7260"/>
+            <w:tcW w:type="dxa" w:w="9360"/>
             <w:gridSpan w:val="2"/>
             <w:shd w:fill="F2F4F7"/>
+            <w:tcW w:w="2300" w:type="dxa"/>
+            <w:vAlign w:val="center"/>
             <w:tcMar>
               <w:top w:w="80" w:type="dxa"/>
+              <w:bottom w:w="80" w:type="dxa"/>
               <w:start w:w="120" w:type="dxa"/>
-              <w:bottom w:w="80" w:type="dxa"/>
               <w:end w:w="120" w:type="dxa"/>
             </w:tcMar>
-            <w:vAlign w:val="center"/>
+            <w:tcW w:w="7060" w:type="dxa"/>
           </w:tcPr>
           <w:p>
             <w:r>
               <w:rPr>
                 <w:rFonts w:ascii="Calibri" w:hAnsi="Calibri"/>
                 <w:b/>
+                <w:i w:val="0"/>
                 <w:color w:val="000000"/>
                 <w:sz w:val="21"/>
               </w:rPr>
@@ -1471,21 +1818,23 @@
       <w:tr>
         <w:tc>
           <w:tcPr>
-            <w:tcW w:type="dxa" w:w="2100"/>
+            <w:tcW w:type="dxa" w:w="4680"/>
             <w:shd w:fill="F2F4F7"/>
+            <w:tcW w:w="2300" w:type="dxa"/>
+            <w:vAlign w:val="center"/>
             <w:tcMar>
               <w:top w:w="80" w:type="dxa"/>
+              <w:bottom w:w="80" w:type="dxa"/>
               <w:start w:w="120" w:type="dxa"/>
-              <w:bottom w:w="80" w:type="dxa"/>
               <w:end w:w="120" w:type="dxa"/>
             </w:tcMar>
-            <w:vAlign w:val="center"/>
           </w:tcPr>
           <w:p>
             <w:r>
               <w:rPr>
                 <w:rFonts w:ascii="Calibri" w:hAnsi="Calibri"/>
                 <w:b/>
+                <w:i w:val="0"/>
                 <w:color w:val="000000"/>
                 <w:sz w:val="21"/>
               </w:rPr>
@@ -1495,19 +1844,22 @@
         </w:tc>
         <w:tc>
           <w:tcPr>
-            <w:tcW w:type="dxa" w:w="7260"/>
+            <w:tcW w:type="dxa" w:w="4680"/>
+            <w:tcW w:w="7060" w:type="dxa"/>
+            <w:vAlign w:val="center"/>
             <w:tcMar>
               <w:top w:w="80" w:type="dxa"/>
+              <w:bottom w:w="80" w:type="dxa"/>
               <w:start w:w="120" w:type="dxa"/>
-              <w:bottom w:w="80" w:type="dxa"/>
               <w:end w:w="120" w:type="dxa"/>
             </w:tcMar>
-            <w:vAlign w:val="center"/>
           </w:tcPr>
           <w:p>
             <w:r>
               <w:rPr>
                 <w:rFonts w:ascii="Calibri" w:hAnsi="Calibri"/>
+                <w:b w:val="0"/>
+                <w:i w:val="0"/>
                 <w:color w:val="000000"/>
                 <w:sz w:val="21"/>
               </w:rPr>
@@ -1519,21 +1871,23 @@
       <w:tr>
         <w:tc>
           <w:tcPr>
-            <w:tcW w:type="dxa" w:w="2100"/>
+            <w:tcW w:type="dxa" w:w="4680"/>
             <w:shd w:fill="F2F4F7"/>
+            <w:tcW w:w="2300" w:type="dxa"/>
+            <w:vAlign w:val="center"/>
             <w:tcMar>
               <w:top w:w="80" w:type="dxa"/>
+              <w:bottom w:w="80" w:type="dxa"/>
               <w:start w:w="120" w:type="dxa"/>
-              <w:bottom w:w="80" w:type="dxa"/>
               <w:end w:w="120" w:type="dxa"/>
             </w:tcMar>
-            <w:vAlign w:val="center"/>
           </w:tcPr>
           <w:p>
             <w:r>
               <w:rPr>
                 <w:rFonts w:ascii="Calibri" w:hAnsi="Calibri"/>
                 <w:b/>
+                <w:i w:val="0"/>
                 <w:color w:val="000000"/>
                 <w:sz w:val="21"/>
               </w:rPr>
@@ -1543,19 +1897,22 @@
         </w:tc>
         <w:tc>
           <w:tcPr>
-            <w:tcW w:type="dxa" w:w="7260"/>
+            <w:tcW w:type="dxa" w:w="4680"/>
+            <w:tcW w:w="7060" w:type="dxa"/>
+            <w:vAlign w:val="center"/>
             <w:tcMar>
               <w:top w:w="80" w:type="dxa"/>
+              <w:bottom w:w="80" w:type="dxa"/>
               <w:start w:w="120" w:type="dxa"/>
-              <w:bottom w:w="80" w:type="dxa"/>
               <w:end w:w="120" w:type="dxa"/>
             </w:tcMar>
-            <w:vAlign w:val="center"/>
           </w:tcPr>
           <w:p>
             <w:r>
               <w:rPr>
                 <w:rFonts w:ascii="Calibri" w:hAnsi="Calibri"/>
+                <w:b w:val="0"/>
+                <w:i w:val="0"/>
                 <w:color w:val="000000"/>
                 <w:sz w:val="21"/>
               </w:rPr>
@@ -1567,21 +1924,23 @@
       <w:tr>
         <w:tc>
           <w:tcPr>
-            <w:tcW w:type="dxa" w:w="2100"/>
+            <w:tcW w:type="dxa" w:w="4680"/>
             <w:shd w:fill="F2F4F7"/>
+            <w:tcW w:w="2300" w:type="dxa"/>
+            <w:vAlign w:val="center"/>
             <w:tcMar>
               <w:top w:w="80" w:type="dxa"/>
+              <w:bottom w:w="80" w:type="dxa"/>
               <w:start w:w="120" w:type="dxa"/>
-              <w:bottom w:w="80" w:type="dxa"/>
               <w:end w:w="120" w:type="dxa"/>
             </w:tcMar>
-            <w:vAlign w:val="center"/>
           </w:tcPr>
           <w:p>
             <w:r>
               <w:rPr>
                 <w:rFonts w:ascii="Calibri" w:hAnsi="Calibri"/>
                 <w:b/>
+                <w:i w:val="0"/>
                 <w:color w:val="000000"/>
                 <w:sz w:val="21"/>
               </w:rPr>
@@ -1591,23 +1950,26 @@
         </w:tc>
         <w:tc>
           <w:tcPr>
-            <w:tcW w:type="dxa" w:w="7260"/>
+            <w:tcW w:type="dxa" w:w="4680"/>
+            <w:tcW w:w="7060" w:type="dxa"/>
+            <w:vAlign w:val="center"/>
             <w:tcMar>
               <w:top w:w="80" w:type="dxa"/>
+              <w:bottom w:w="80" w:type="dxa"/>
               <w:start w:w="120" w:type="dxa"/>
-              <w:bottom w:w="80" w:type="dxa"/>
               <w:end w:w="120" w:type="dxa"/>
             </w:tcMar>
-            <w:vAlign w:val="center"/>
           </w:tcPr>
           <w:p>
             <w:r>
               <w:rPr>
                 <w:rFonts w:ascii="Calibri" w:hAnsi="Calibri"/>
+                <w:b w:val="0"/>
+                <w:i w:val="0"/>
                 <w:color w:val="000000"/>
                 <w:sz w:val="21"/>
               </w:rPr>
-              <w:t>The housing ratio may look plausible alone, but the back-end ratio is high for a conservative ability-to-repay file, especially with self-employed income that remains unverified.</w:t>
+              <w:t>The housing ratio may look plausible alone, but the back-end ratio is high for a conservative ability-to-repay file. Gross business deposits should not be used as income without net-income verification.</w:t>
             </w:r>
           </w:p>
         </w:tc>
@@ -1615,19 +1977,20 @@
     </w:tbl>
     <w:p>
       <w:pPr>
-        <w:spacing w:after="40"/>
+        <w:spacing w:before="0" w:after="40" w:line="264" w:lineRule="auto"/>
       </w:pPr>
     </w:p>
     <w:p>
       <w:pPr>
         <w:pStyle w:val="Heading2"/>
         <w:keepNext/>
-        <w:spacing w:before="240" w:after="120"/>
+        <w:spacing w:before="200" w:after="100"/>
       </w:pPr>
       <w:r>
         <w:rPr>
           <w:rFonts w:ascii="Calibri" w:hAnsi="Calibri"/>
           <w:b/>
+          <w:i w:val="0"/>
           <w:color w:val="2E74B5"/>
           <w:sz w:val="26"/>
         </w:rPr>
@@ -1642,10 +2005,11 @@
         <w:rPr>
           <w:rFonts w:ascii="Calibri" w:hAnsi="Calibri"/>
           <w:b w:val="0"/>
+          <w:i w:val="0"/>
           <w:color w:val="000000"/>
           <w:sz w:val="22"/>
         </w:rPr>
-        <w:t>The file does not prove available cash for the $6,000 earnest money, the $20,790 total down payment, closing costs, post-closing reserves, or repair capacity after the buyer takes responsibility for the property. The bank statements generally show very low ending balances; the latest provided 2025 statement ending balance is $503.73.</w:t>
+        <w:t>The new business bank statements still do not prove cash to close. The latest business statement ending balance is $5,058.11 and the latest provided personal statement ending balance is $503.73. Those balances do not prove the $6,000 earnest money, $20,790 total down payment, closing funds, and post-closing reserves.</w:t>
       </w:r>
     </w:p>
     <w:p>
@@ -1658,6 +2022,7 @@
         <w:rPr>
           <w:rFonts w:ascii="Calibri" w:hAnsi="Calibri"/>
           <w:b/>
+          <w:i w:val="0"/>
           <w:color w:val="2E74B5"/>
           <w:sz w:val="32"/>
         </w:rPr>
@@ -1667,10 +2032,11 @@
     <w:tbl>
       <w:tblPr>
         <w:tblStyle w:val="TableGrid"/>
-        <w:tblW w:type="dxa" w:w="9360"/>
+        <w:tblW w:type="auto" w:w="0"/>
         <w:jc w:val="left"/>
         <w:tblLayout w:type="fixed"/>
         <w:tblLook w:firstColumn="1" w:firstRow="1" w:lastColumn="0" w:lastRow="0" w:noHBand="0" w:noVBand="1" w:val="04A0"/>
+        <w:tblW w:w="9360" w:type="dxa"/>
         <w:tblInd w:w="120" w:type="dxa"/>
       </w:tblPr>
       <w:tblGrid>
@@ -1681,22 +2047,21 @@
           <w:tcPr>
             <w:tcW w:type="dxa" w:w="9360"/>
             <w:shd w:fill="F8EAEA"/>
+            <w:tcW w:w="9360" w:type="dxa"/>
+            <w:vAlign w:val="center"/>
             <w:tcMar>
               <w:top w:w="80" w:type="dxa"/>
+              <w:bottom w:w="80" w:type="dxa"/>
               <w:start w:w="120" w:type="dxa"/>
-              <w:bottom w:w="80" w:type="dxa"/>
               <w:end w:w="120" w:type="dxa"/>
             </w:tcMar>
-            <w:vAlign w:val="center"/>
           </w:tcPr>
           <w:p>
-            <w:pPr>
-              <w:spacing w:after="80"/>
-            </w:pPr>
             <w:r>
               <w:rPr>
                 <w:rFonts w:ascii="Calibri" w:hAnsi="Calibri"/>
                 <w:b/>
+                <w:i w:val="0"/>
                 <w:color w:val="9B1C1C"/>
                 <w:sz w:val="22"/>
               </w:rPr>
@@ -1705,15 +2070,17 @@
           </w:p>
           <w:p>
             <w:pPr>
-              <w:spacing w:after="40" w:line="264" w:lineRule="auto"/>
+              <w:spacing w:line="264" w:lineRule="auto"/>
             </w:pPr>
             <w:r>
               <w:rPr>
                 <w:rFonts w:ascii="Calibri" w:hAnsi="Calibri"/>
+                <w:b w:val="0"/>
+                <w:i w:val="0"/>
                 <w:color w:val="000000"/>
                 <w:sz w:val="21"/>
               </w:rPr>
-              <w:t>Do not approve the buyer from the current file. This is not necessarily a permanent final decline if Wes wants to request additional documentation, but the current package does not support a defensible approval.</w:t>
+              <w:t>Do not approve the buyer from the current file. The new documents support conditional reconsideration, not approval. Approval should wait for verified net self-employment income, proof of down payment and reserves, current personal bank statements, and attorney/compliance review.</w:t>
             </w:r>
           </w:p>
         </w:tc>
@@ -1721,22 +2088,8 @@
     </w:tbl>
     <w:p>
       <w:pPr>
-        <w:spacing w:after="40"/>
+        <w:spacing w:before="0" w:after="40" w:line="264" w:lineRule="auto"/>
       </w:pPr>
-    </w:p>
-    <w:p>
-      <w:pPr>
-        <w:spacing w:before="0" w:after="120" w:line="264" w:lineRule="auto"/>
-      </w:pPr>
-      <w:r>
-        <w:rPr>
-          <w:rFonts w:ascii="Calibri" w:hAnsi="Calibri"/>
-          <w:b w:val="0"/>
-          <w:color w:val="000000"/>
-          <w:sz w:val="22"/>
-        </w:rPr>
-        <w:t>The key blockers are unverified self-employment income, a high back-end ratio even if the unverified income is used, stale 2025 bank statements, no proof of down payment or reserves, and unexplained transfer activity that should not be counted as stable income without support.</w:t>
-      </w:r>
     </w:p>
     <w:p>
       <w:pPr>
@@ -1748,6 +2101,7 @@
         <w:rPr>
           <w:rFonts w:ascii="Calibri" w:hAnsi="Calibri"/>
           <w:b/>
+          <w:i w:val="0"/>
           <w:color w:val="2E74B5"/>
           <w:sz w:val="32"/>
         </w:rPr>
@@ -1757,12 +2111,14 @@
     <w:p>
       <w:pPr>
         <w:pStyle w:val="ListNumber"/>
-        <w:spacing w:after="160" w:line="280" w:lineRule="auto"/>
+        <w:spacing w:after="140" w:line="280" w:lineRule="auto"/>
         <w:ind w:left="720" w:hanging="360"/>
       </w:pPr>
       <w:r>
         <w:rPr>
           <w:rFonts w:ascii="Calibri" w:hAnsi="Calibri"/>
+          <w:b w:val="0"/>
+          <w:i w:val="0"/>
           <w:color w:val="000000"/>
           <w:sz w:val="22"/>
         </w:rPr>
@@ -1772,72 +2128,82 @@
     <w:p>
       <w:pPr>
         <w:pStyle w:val="ListNumber"/>
-        <w:spacing w:after="160" w:line="280" w:lineRule="auto"/>
+        <w:spacing w:after="140" w:line="280" w:lineRule="auto"/>
         <w:ind w:left="720" w:hanging="360"/>
       </w:pPr>
       <w:r>
         <w:rPr>
           <w:rFonts w:ascii="Calibri" w:hAnsi="Calibri"/>
+          <w:b w:val="0"/>
+          <w:i w:val="0"/>
           <w:color w:val="000000"/>
           <w:sz w:val="22"/>
         </w:rPr>
-        <w:t>Current 2026 bank statements through the application month for every account used for business or household income.</w:t>
+        <w:t>Current 2026 personal bank statements through the application month.</w:t>
       </w:r>
     </w:p>
     <w:p>
       <w:pPr>
         <w:pStyle w:val="ListNumber"/>
-        <w:spacing w:after="160" w:line="280" w:lineRule="auto"/>
+        <w:spacing w:after="140" w:line="280" w:lineRule="auto"/>
         <w:ind w:left="720" w:hanging="360"/>
       </w:pPr>
       <w:r>
         <w:rPr>
           <w:rFonts w:ascii="Calibri" w:hAnsi="Calibri"/>
+          <w:b w:val="0"/>
+          <w:i w:val="0"/>
           <w:color w:val="000000"/>
           <w:sz w:val="22"/>
         </w:rPr>
-        <w:t>Self-employment income package: tax returns, year-to-date profit-and-loss, 1099s, invoices, contracts, or customer/payment verification.</w:t>
+        <w:t>Self-employment income package: tax returns, year-to-date profit-and-loss, 1099s, invoices/contracts, payroll or owner-draw records, and customer/payment verification where available.</w:t>
       </w:r>
     </w:p>
     <w:p>
       <w:pPr>
         <w:pStyle w:val="ListNumber"/>
-        <w:spacing w:after="160" w:line="280" w:lineRule="auto"/>
+        <w:spacing w:after="140" w:line="280" w:lineRule="auto"/>
         <w:ind w:left="720" w:hanging="360"/>
       </w:pPr>
       <w:r>
         <w:rPr>
           <w:rFonts w:ascii="Calibri" w:hAnsi="Calibri"/>
+          <w:b w:val="0"/>
+          <w:i w:val="0"/>
           <w:color w:val="000000"/>
           <w:sz w:val="22"/>
         </w:rPr>
-        <w:t>Explanation of Matthew Flooring LLC relationship and whether payments are wages, contractor payments, owner draws, or customer receipts.</w:t>
+        <w:t>Explanation of Ever's ownership, officer role, or compensation relationship with Matthew Flooring LLC.</w:t>
       </w:r>
     </w:p>
     <w:p>
       <w:pPr>
         <w:pStyle w:val="ListNumber"/>
-        <w:spacing w:after="160" w:line="280" w:lineRule="auto"/>
+        <w:spacing w:after="140" w:line="280" w:lineRule="auto"/>
         <w:ind w:left="720" w:hanging="360"/>
       </w:pPr>
       <w:r>
         <w:rPr>
           <w:rFonts w:ascii="Calibri" w:hAnsi="Calibri"/>
+          <w:b w:val="0"/>
+          <w:i w:val="0"/>
           <w:color w:val="000000"/>
           <w:sz w:val="22"/>
         </w:rPr>
-        <w:t>Explanation and documentation for the Kimberly Terrill Zelle activity and outgoing "Yo Ever" transfers.</w:t>
+        <w:t>Explanation and documentation for material non-routine transfer activity, including Kimberly Terrill activity and outgoing "Yo Ever" transfers.</w:t>
       </w:r>
     </w:p>
     <w:p>
       <w:pPr>
         <w:pStyle w:val="ListNumber"/>
-        <w:spacing w:after="160" w:line="280" w:lineRule="auto"/>
+        <w:spacing w:after="140" w:line="280" w:lineRule="auto"/>
         <w:ind w:left="720" w:hanging="360"/>
       </w:pPr>
       <w:r>
         <w:rPr>
           <w:rFonts w:ascii="Calibri" w:hAnsi="Calibri"/>
+          <w:b w:val="0"/>
+          <w:i w:val="0"/>
           <w:color w:val="000000"/>
           <w:sz w:val="22"/>
         </w:rPr>
@@ -1847,12 +2213,14 @@
     <w:p>
       <w:pPr>
         <w:pStyle w:val="ListNumber"/>
-        <w:spacing w:after="160" w:line="280" w:lineRule="auto"/>
+        <w:spacing w:after="140" w:line="280" w:lineRule="auto"/>
         <w:ind w:left="720" w:hanging="360"/>
       </w:pPr>
       <w:r>
         <w:rPr>
           <w:rFonts w:ascii="Calibri" w:hAnsi="Calibri"/>
+          <w:b w:val="0"/>
+          <w:i w:val="0"/>
           <w:color w:val="000000"/>
           <w:sz w:val="22"/>
         </w:rPr>
@@ -1862,27 +2230,14 @@
     <w:p>
       <w:pPr>
         <w:pStyle w:val="ListNumber"/>
-        <w:spacing w:after="160" w:line="280" w:lineRule="auto"/>
+        <w:spacing w:after="140" w:line="280" w:lineRule="auto"/>
         <w:ind w:left="720" w:hanging="360"/>
       </w:pPr>
       <w:r>
         <w:rPr>
           <w:rFonts w:ascii="Calibri" w:hAnsi="Calibri"/>
-          <w:color w:val="000000"/>
-          <w:sz w:val="22"/>
-        </w:rPr>
-        <w:t>Current rent ledger or rent-payment history for Tensity.</w:t>
-      </w:r>
-    </w:p>
-    <w:p>
-      <w:pPr>
-        <w:pStyle w:val="ListNumber"/>
-        <w:spacing w:after="160" w:line="280" w:lineRule="auto"/>
-        <w:ind w:left="720" w:hanging="360"/>
-      </w:pPr>
-      <w:r>
-        <w:rPr>
-          <w:rFonts w:ascii="Calibri" w:hAnsi="Calibri"/>
+          <w:b w:val="0"/>
+          <w:i w:val="0"/>
           <w:color w:val="000000"/>
           <w:sz w:val="22"/>
         </w:rPr>
@@ -1892,12 +2247,14 @@
     <w:p>
       <w:pPr>
         <w:pStyle w:val="ListNumber"/>
-        <w:spacing w:after="160" w:line="280" w:lineRule="auto"/>
+        <w:spacing w:after="140" w:line="280" w:lineRule="auto"/>
         <w:ind w:left="720" w:hanging="360"/>
       </w:pPr>
       <w:r>
         <w:rPr>
           <w:rFonts w:ascii="Calibri" w:hAnsi="Calibri"/>
+          <w:b w:val="0"/>
+          <w:i w:val="0"/>
           <w:color w:val="000000"/>
           <w:sz w:val="22"/>
         </w:rPr>
@@ -1914,6 +2271,7 @@
         <w:rPr>
           <w:rFonts w:ascii="Calibri" w:hAnsi="Calibri"/>
           <w:b/>
+          <w:i w:val="0"/>
           <w:color w:val="2E74B5"/>
           <w:sz w:val="32"/>
         </w:rPr>
@@ -1923,12 +2281,14 @@
     <w:p>
       <w:pPr>
         <w:pStyle w:val="ListBullet"/>
-        <w:spacing w:after="160" w:line="280" w:lineRule="auto"/>
+        <w:spacing w:after="140" w:line="280" w:lineRule="auto"/>
         <w:ind w:left="720" w:hanging="360"/>
       </w:pPr>
       <w:r>
         <w:rPr>
           <w:rFonts w:ascii="Calibri" w:hAnsi="Calibri"/>
+          <w:b w:val="0"/>
+          <w:i w:val="0"/>
           <w:color w:val="000000"/>
           <w:sz w:val="22"/>
         </w:rPr>
@@ -1938,12 +2298,14 @@
     <w:p>
       <w:pPr>
         <w:pStyle w:val="ListBullet"/>
-        <w:spacing w:after="160" w:line="280" w:lineRule="auto"/>
+        <w:spacing w:after="140" w:line="280" w:lineRule="auto"/>
         <w:ind w:left="720" w:hanging="360"/>
       </w:pPr>
       <w:r>
         <w:rPr>
           <w:rFonts w:ascii="Calibri" w:hAnsi="Calibri"/>
+          <w:b w:val="0"/>
+          <w:i w:val="0"/>
           <w:color w:val="000000"/>
           <w:sz w:val="22"/>
         </w:rPr>
@@ -1953,12 +2315,14 @@
     <w:p>
       <w:pPr>
         <w:pStyle w:val="ListBullet"/>
-        <w:spacing w:after="160" w:line="280" w:lineRule="auto"/>
+        <w:spacing w:after="140" w:line="280" w:lineRule="auto"/>
         <w:ind w:left="720" w:hanging="360"/>
       </w:pPr>
       <w:r>
         <w:rPr>
           <w:rFonts w:ascii="Calibri" w:hAnsi="Calibri"/>
+          <w:b w:val="0"/>
+          <w:i w:val="0"/>
           <w:color w:val="000000"/>
           <w:sz w:val="22"/>
         </w:rPr>
@@ -1968,16 +2332,18 @@
     <w:p>
       <w:pPr>
         <w:pStyle w:val="ListBullet"/>
-        <w:spacing w:after="160" w:line="280" w:lineRule="auto"/>
+        <w:spacing w:after="140" w:line="280" w:lineRule="auto"/>
         <w:ind w:left="720" w:hanging="360"/>
       </w:pPr>
       <w:r>
         <w:rPr>
           <w:rFonts w:ascii="Calibri" w:hAnsi="Calibri"/>
+          <w:b w:val="0"/>
+          <w:i w:val="0"/>
           <w:color w:val="000000"/>
           <w:sz w:val="22"/>
         </w:rPr>
-        <w:t>Any approval reconsideration should be documented with a fresh ability-to-repay worksheet using verified current income and reserve evidence.</w:t>
+        <w:t>Any approval reconsideration should be documented with a fresh ability-to-repay worksheet using verified net income and reserve evidence.</w:t>
       </w:r>
     </w:p>
     <w:p>
@@ -1990,6 +2356,7 @@
         <w:rPr>
           <w:rFonts w:ascii="Calibri" w:hAnsi="Calibri"/>
           <w:b/>
+          <w:i w:val="0"/>
           <w:color w:val="2E74B5"/>
           <w:sz w:val="32"/>
         </w:rPr>
@@ -2004,6 +2371,7 @@
         <w:rPr>
           <w:rFonts w:ascii="Calibri" w:hAnsi="Calibri"/>
           <w:b/>
+          <w:i w:val="0"/>
           <w:color w:val="000000"/>
           <w:sz w:val="22"/>
         </w:rPr>
@@ -2018,6 +2386,7 @@
         <w:rPr>
           <w:rFonts w:ascii="Calibri" w:hAnsi="Calibri"/>
           <w:b w:val="0"/>
+          <w:i w:val="0"/>
           <w:color w:val="000000"/>
           <w:sz w:val="22"/>
         </w:rPr>
@@ -2043,10 +2412,11 @@
       <w:pStyle w:val="Footer"/>
       <w:jc w:val="center"/>
     </w:pPr>
-    <w:r/>
     <w:r>
       <w:rPr>
         <w:rFonts w:ascii="Calibri" w:hAnsi="Calibri"/>
+        <w:b w:val="0"/>
+        <w:i w:val="0"/>
         <w:color w:val="5A5A5A"/>
         <w:sz w:val="17"/>
       </w:rPr>
@@ -2061,12 +2431,12 @@
   <w:p>
     <w:pPr>
       <w:pStyle w:val="Header"/>
-      <w:jc w:val="left"/>
     </w:pPr>
-    <w:r/>
     <w:r>
       <w:rPr>
         <w:rFonts w:ascii="Calibri" w:hAnsi="Calibri"/>
+        <w:b w:val="0"/>
+        <w:i w:val="0"/>
         <w:color w:val="5A5A5A"/>
         <w:sz w:val="18"/>
       </w:rPr>
@@ -2440,7 +2810,7 @@
     <w:qFormat/>
     <w:rsid w:val="00FC693F"/>
     <w:pPr>
-      <w:spacing w:after="120" w:line="264" w:lineRule="auto"/>
+      <w:spacing w:after="120"/>
     </w:pPr>
     <w:rPr>
       <w:rFonts w:ascii="Calibri" w:hAnsi="Calibri"/>
@@ -2974,6 +3344,7 @@
       <w:numPr>
         <w:numId w:val="1"/>
       </w:numPr>
+      <w:spacing w:after="120"/>
       <w:contextualSpacing/>
     </w:pPr>
     <w:rPr>
@@ -3017,6 +3388,7 @@
       <w:numPr>
         <w:numId w:val="5"/>
       </w:numPr>
+      <w:spacing w:after="120"/>
       <w:contextualSpacing/>
     </w:pPr>
     <w:rPr>

</xml_diff>